<commit_message>
feat(backend): integración de Gemini 3.6-flash para el motor de pre-triaje
</commit_message>
<xml_diff>
--- a/Documento Proyecto Final.docx
+++ b/Documento Proyecto Final.docx
@@ -71,16 +71,16 @@
         <w:rPr>
           <w:rFonts w:ascii="Verdana" w:eastAsia="Verdana" w:hAnsi="Verdana" w:cs="Verdana"/>
           <w:b/>
-          <w:sz w:val="52"/>
-          <w:szCs w:val="52"/>
+          <w:sz w:val="48"/>
+          <w:szCs w:val="48"/>
         </w:rPr>
       </w:pPr>
       <w:r>
         <w:rPr>
           <w:rFonts w:ascii="Verdana" w:eastAsia="Verdana" w:hAnsi="Verdana" w:cs="Verdana"/>
           <w:b/>
-          <w:sz w:val="52"/>
-          <w:szCs w:val="52"/>
+          <w:sz w:val="48"/>
+          <w:szCs w:val="48"/>
         </w:rPr>
         <w:t xml:space="preserve">HERRAMIENTAS </w:t>
       </w:r>
@@ -88,8 +88,8 @@
         <w:rPr>
           <w:rFonts w:ascii="Verdana" w:eastAsia="Verdana" w:hAnsi="Verdana" w:cs="Verdana"/>
           <w:b/>
-          <w:sz w:val="52"/>
-          <w:szCs w:val="52"/>
+          <w:sz w:val="48"/>
+          <w:szCs w:val="48"/>
         </w:rPr>
         <w:t>DE DESARROLLO PROFESIONAL TIC</w:t>
       </w:r>
@@ -337,6 +337,11 @@
       <w:r>
         <w:t>6</w:t>
       </w:r>
+    </w:p>
+    <w:p>
+      <w:pPr>
+        <w:jc w:val="right"/>
+      </w:pPr>
     </w:p>
     <w:p>
       <w:pPr>

</xml_diff>

<commit_message>
refactor(frontend): implementación de enrutamiento y modularización de componentes
</commit_message>
<xml_diff>
--- a/Documento Proyecto Final.docx
+++ b/Documento Proyecto Final.docx
@@ -93,6 +93,15 @@
         </w:rPr>
         <w:t>DE DESARROLLO PROFESIONAL TIC</w:t>
       </w:r>
+      <w:r>
+        <w:rPr>
+          <w:rFonts w:ascii="Verdana" w:eastAsia="Verdana" w:hAnsi="Verdana" w:cs="Verdana"/>
+          <w:b/>
+          <w:sz w:val="48"/>
+          <w:szCs w:val="48"/>
+        </w:rPr>
+        <w:t xml:space="preserve"> (49224)</w:t>
+      </w:r>
     </w:p>
     <w:p/>
     <w:p>
@@ -346,64 +355,1213 @@
     <w:p>
       <w:pPr>
         <w:spacing w:after="0" w:line="480" w:lineRule="auto"/>
-        <w:jc w:val="center"/>
-        <w:rPr>
-          <w:rFonts w:ascii="Arial Narrow" w:eastAsia="Arial" w:hAnsi="Arial Narrow" w:cs="Arial"/>
+        <w:rPr>
           <w:b/>
           <w:bCs/>
-          <w:u w:val="single"/>
-        </w:rPr>
-      </w:pPr>
-      <w:r>
-        <w:rPr>
-          <w:rFonts w:ascii="Arial Narrow" w:eastAsia="Arial" w:hAnsi="Arial Narrow" w:cs="Arial"/>
+        </w:rPr>
+      </w:pPr>
+      <w:r>
+        <w:rPr>
           <w:b/>
           <w:bCs/>
-          <w:u w:val="single"/>
         </w:rPr>
         <w:lastRenderedPageBreak/>
-        <w:t> </w:t>
-      </w:r>
-      <w:r>
-        <w:rPr>
-          <w:rFonts w:ascii="Arial Narrow" w:eastAsia="Arial" w:hAnsi="Arial Narrow" w:cs="Arial"/>
+        <w:t>Resumen ejecutivo</w:t>
+      </w:r>
+    </w:p>
+    <w:p>
+      <w:pPr>
+        <w:spacing w:after="0" w:line="480" w:lineRule="auto"/>
+        <w:jc w:val="both"/>
+      </w:pPr>
+      <w:r>
+        <w:t>El presente informe detalla la Fase 1</w:t>
+      </w:r>
+      <w:r>
+        <w:t xml:space="preserve"> </w:t>
+      </w:r>
+      <w:r>
+        <w:t xml:space="preserve">de </w:t>
+      </w:r>
+      <w:proofErr w:type="spellStart"/>
+      <w:r>
+        <w:rPr>
           <w:b/>
           <w:bCs/>
-          <w:u w:val="single"/>
-        </w:rPr>
-        <w:t>Portafolio Final: Postulación a Beca</w:t>
+        </w:rPr>
+        <w:t>MediSync</w:t>
+      </w:r>
+      <w:proofErr w:type="spellEnd"/>
+      <w:r>
+        <w:rPr>
+          <w:b/>
+          <w:bCs/>
+        </w:rPr>
+        <w:t xml:space="preserve"> Perú</w:t>
+      </w:r>
+      <w:r>
+        <w:t xml:space="preserve">, una plataforma digital integral diseñada para modernizar la gestión hospitalaria y optimizar el </w:t>
+      </w:r>
+      <w:proofErr w:type="spellStart"/>
+      <w:r>
+        <w:t>pre-triaje</w:t>
+      </w:r>
+      <w:proofErr w:type="spellEnd"/>
+      <w:r>
+        <w:t xml:space="preserve"> de pacientes. Esta etapa inicial se centró en establecer los cimientos tecnológicos del sistema, implementando una arquitectura robusta, escalable y libre de deuda técnica mediante un modelo de </w:t>
+      </w:r>
+      <w:proofErr w:type="spellStart"/>
+      <w:r>
+        <w:t>monorepositorio</w:t>
+      </w:r>
+      <w:proofErr w:type="spellEnd"/>
+      <w:r>
+        <w:t xml:space="preserve"> (</w:t>
+      </w:r>
+      <w:proofErr w:type="spellStart"/>
+      <w:r>
+        <w:rPr>
+          <w:i/>
+          <w:iCs/>
+        </w:rPr>
+        <w:t>monorepo</w:t>
+      </w:r>
+      <w:proofErr w:type="spellEnd"/>
+      <w:r>
+        <w:t xml:space="preserve">). Para la capa visual, se integraron tecnologías de alto rendimiento como </w:t>
+      </w:r>
+      <w:proofErr w:type="spellStart"/>
+      <w:r>
+        <w:t>React</w:t>
+      </w:r>
+      <w:proofErr w:type="spellEnd"/>
+      <w:r>
+        <w:t xml:space="preserve">, </w:t>
+      </w:r>
+      <w:proofErr w:type="spellStart"/>
+      <w:r>
+        <w:t>TypeScript</w:t>
+      </w:r>
+      <w:proofErr w:type="spellEnd"/>
+      <w:r>
+        <w:t xml:space="preserve"> y Vite, junto con </w:t>
+      </w:r>
+      <w:proofErr w:type="spellStart"/>
+      <w:r>
+        <w:t>Tailwind</w:t>
+      </w:r>
+      <w:proofErr w:type="spellEnd"/>
+      <w:r>
+        <w:t xml:space="preserve"> CSS para garantizar interfaces limpias y responsivas.</w:t>
       </w:r>
     </w:p>
     <w:p>
       <w:pPr>
-        <w:tabs>
-          <w:tab w:val="left" w:pos="3504"/>
-        </w:tabs>
-      </w:pPr>
-      <w:r>
-        <w:rPr>
-          <w:rFonts w:ascii="Arial Narrow" w:eastAsia="Arial" w:hAnsi="Arial Narrow" w:cs="Arial"/>
+        <w:spacing w:after="0" w:line="480" w:lineRule="auto"/>
+        <w:jc w:val="both"/>
+      </w:pPr>
+      <w:r>
+        <w:t xml:space="preserve">El núcleo técnico de esta fase radicó en la implementación de prácticas de </w:t>
+      </w:r>
+      <w:r>
+        <w:rPr>
           <w:b/>
           <w:bCs/>
         </w:rPr>
-        <w:t>Enlace al video en You</w:t>
-      </w:r>
-      <w:r>
-        <w:rPr>
-          <w:rFonts w:ascii="Arial Narrow" w:eastAsia="Arial" w:hAnsi="Arial Narrow" w:cs="Arial"/>
+        <w:t>DevOps e Integración Continua (CI/CD)</w:t>
+      </w:r>
+      <w:r>
+        <w:t xml:space="preserve"> a nivel local. Para evitar la fragmentación del código a medida que el proyecto escale, se configuró un ecosistema de calidad estricto. Se implementaron herramientas de análisis estático (</w:t>
+      </w:r>
+      <w:proofErr w:type="spellStart"/>
+      <w:r>
+        <w:t>ESLint</w:t>
+      </w:r>
+      <w:proofErr w:type="spellEnd"/>
+      <w:r>
+        <w:t>) y formateo estandarizado (</w:t>
+      </w:r>
+      <w:proofErr w:type="spellStart"/>
+      <w:r>
+        <w:t>Prettier</w:t>
+      </w:r>
+      <w:proofErr w:type="spellEnd"/>
+      <w:r>
+        <w:t>), las cuales fueron orquestadas mediante ganchos de validación (</w:t>
+      </w:r>
+      <w:proofErr w:type="spellStart"/>
+      <w:r>
+        <w:rPr>
+          <w:i/>
+          <w:iCs/>
+        </w:rPr>
+        <w:t>pre-commit</w:t>
+      </w:r>
+      <w:proofErr w:type="spellEnd"/>
+      <w:r>
+        <w:rPr>
+          <w:i/>
+          <w:iCs/>
+        </w:rPr>
+        <w:t xml:space="preserve"> </w:t>
+      </w:r>
+      <w:proofErr w:type="spellStart"/>
+      <w:r>
+        <w:rPr>
+          <w:i/>
+          <w:iCs/>
+        </w:rPr>
+        <w:t>hooks</w:t>
+      </w:r>
+      <w:proofErr w:type="spellEnd"/>
+      <w:r>
+        <w:t xml:space="preserve">) controlados por la herramienta </w:t>
+      </w:r>
+      <w:r>
+        <w:rPr>
           <w:b/>
           <w:bCs/>
         </w:rPr>
-        <w:t xml:space="preserve">Tube: </w:t>
+        <w:t>Husky</w:t>
+      </w:r>
+      <w:r>
+        <w:t>.</w:t>
+      </w:r>
+    </w:p>
+    <w:p>
+      <w:pPr>
+        <w:spacing w:after="0" w:line="480" w:lineRule="auto"/>
+        <w:jc w:val="both"/>
+      </w:pPr>
+      <w:r>
+        <w:t xml:space="preserve">Esta infraestructura de seguridad automatizada asegura que cualquier línea de código sea inspeccionada rigurosamente antes de ser registrada en el control de versiones (Git). Si el sistema detecta vulnerabilidades, variables huérfanas o errores de sintaxis, el </w:t>
+      </w:r>
+      <w:proofErr w:type="spellStart"/>
+      <w:r>
+        <w:rPr>
+          <w:i/>
+          <w:iCs/>
+        </w:rPr>
+        <w:t>commit</w:t>
+      </w:r>
+      <w:proofErr w:type="spellEnd"/>
+      <w:r>
+        <w:t xml:space="preserve"> es bloqueado de inmediato. Esto garantiza que el repositorio principal reciba única y exclusivamente código funcional e impecable.</w:t>
+      </w:r>
+    </w:p>
+    <w:p>
+      <w:pPr>
+        <w:spacing w:after="0" w:line="480" w:lineRule="auto"/>
+        <w:jc w:val="both"/>
+      </w:pPr>
+      <w:r>
+        <w:t xml:space="preserve">Como resultado de esta primera etapa, </w:t>
+      </w:r>
+      <w:proofErr w:type="spellStart"/>
+      <w:r>
+        <w:t>MediSync</w:t>
+      </w:r>
+      <w:proofErr w:type="spellEnd"/>
+      <w:r>
+        <w:t xml:space="preserve"> Perú cuenta con un entorno de desarrollo estandarizado bajo métricas profesionales de la industria. El proyecto ha mitigado los riesgos técnicos iniciales y cuenta con una base sólida, preparando el terreno en condiciones óptimas para el posterior desarrollo del servidor </w:t>
+      </w:r>
+      <w:proofErr w:type="spellStart"/>
+      <w:r>
+        <w:rPr>
+          <w:i/>
+          <w:iCs/>
+        </w:rPr>
+        <w:t>backend</w:t>
+      </w:r>
+      <w:proofErr w:type="spellEnd"/>
+      <w:r>
+        <w:t xml:space="preserve"> y la integración de motores de Inteligencia Artificial.</w:t>
+      </w:r>
+    </w:p>
+    <w:p>
+      <w:pPr>
+        <w:spacing w:after="0" w:line="480" w:lineRule="auto"/>
+        <w:jc w:val="both"/>
+      </w:pPr>
+    </w:p>
+    <w:p>
+      <w:pPr>
+        <w:spacing w:after="0" w:line="480" w:lineRule="auto"/>
+        <w:rPr>
+          <w:b/>
+          <w:bCs/>
+        </w:rPr>
+      </w:pPr>
+      <w:r>
+        <w:rPr>
+          <w:b/>
+          <w:bCs/>
+        </w:rPr>
+        <w:t>Descripción de la empresa y el problema/oportunidad identificada</w:t>
+      </w:r>
+    </w:p>
+    <w:p>
+      <w:pPr>
+        <w:spacing w:after="0" w:line="480" w:lineRule="auto"/>
+        <w:jc w:val="both"/>
+      </w:pPr>
+      <w:r>
+        <w:rPr>
+          <w:b/>
+          <w:bCs/>
+        </w:rPr>
+        <w:t>La Empresa/Contexto:</w:t>
+      </w:r>
+      <w:r>
+        <w:t xml:space="preserve"> Clínicas y centros de salud en Perú (simulado bajo el nombre </w:t>
+      </w:r>
+      <w:proofErr w:type="spellStart"/>
+      <w:r>
+        <w:t>MediSync</w:t>
+      </w:r>
+      <w:proofErr w:type="spellEnd"/>
+      <w:r>
+        <w:t xml:space="preserve"> Perú) que enfrentan alta demanda diaria de pacientes en sus áreas de emergencias y consultorios externos.</w:t>
+      </w:r>
+    </w:p>
+    <w:p>
+      <w:pPr>
+        <w:spacing w:after="0" w:line="480" w:lineRule="auto"/>
+        <w:jc w:val="both"/>
+      </w:pPr>
+      <w:r>
+        <w:rPr>
+          <w:b/>
+          <w:bCs/>
+        </w:rPr>
+        <w:t>El Problema:</w:t>
+      </w:r>
+      <w:r>
+        <w:t xml:space="preserve"> Tiempos de espera prolongados, saturación del personal médico en la etapa inicial de </w:t>
+      </w:r>
+      <w:proofErr w:type="spellStart"/>
+      <w:r>
+        <w:t>triaje</w:t>
+      </w:r>
+      <w:proofErr w:type="spellEnd"/>
+      <w:r>
+        <w:t xml:space="preserve"> y errores de captura de datos debido a procesos manuales. Adicionalmente, a nivel de software, los proyectos hospitalarios suelen sufrir de código desordenado y difícil de mantener cuando escalan.</w:t>
+      </w:r>
+    </w:p>
+    <w:p>
+      <w:pPr>
+        <w:spacing w:after="0" w:line="480" w:lineRule="auto"/>
+        <w:jc w:val="both"/>
+      </w:pPr>
+      <w:r>
+        <w:rPr>
+          <w:b/>
+          <w:bCs/>
+        </w:rPr>
+        <w:t>La Oportunidad:</w:t>
+      </w:r>
+      <w:r>
+        <w:t xml:space="preserve"> Crear un entorno de desarrollo profesional desde el inicio que permita construir una plataforma digital estandarizada, rápida (usando Vite y </w:t>
+      </w:r>
+      <w:proofErr w:type="spellStart"/>
+      <w:r>
+        <w:t>React</w:t>
+      </w:r>
+      <w:proofErr w:type="spellEnd"/>
+      <w:r>
+        <w:t>) y con interfaces limpias (</w:t>
+      </w:r>
+      <w:proofErr w:type="spellStart"/>
+      <w:r>
+        <w:t>Tailwind</w:t>
+      </w:r>
+      <w:proofErr w:type="spellEnd"/>
+      <w:r>
+        <w:t xml:space="preserve"> CSS), capaz de recibir módulos complejos (IA, </w:t>
+      </w:r>
+      <w:proofErr w:type="spellStart"/>
+      <w:r>
+        <w:t>IoT</w:t>
+      </w:r>
+      <w:proofErr w:type="spellEnd"/>
+      <w:r>
+        <w:t>) en el futuro sin que el sistema colapse.</w:t>
+      </w:r>
+    </w:p>
+    <w:p>
+      <w:pPr>
+        <w:spacing w:after="0" w:line="480" w:lineRule="auto"/>
+        <w:rPr>
+          <w:b/>
+          <w:bCs/>
+        </w:rPr>
+      </w:pPr>
+      <w:r>
+        <w:rPr>
+          <w:b/>
+          <w:bCs/>
+        </w:rPr>
+        <w:t>Objetivos del proyecto (Fase TA1)</w:t>
+      </w:r>
+    </w:p>
+    <w:p>
+      <w:pPr>
+        <w:numPr>
+          <w:ilvl w:val="0"/>
+          <w:numId w:val="45"/>
+        </w:numPr>
+        <w:spacing w:after="0" w:line="480" w:lineRule="auto"/>
+        <w:jc w:val="both"/>
+      </w:pPr>
+      <w:r>
+        <w:rPr>
+          <w:b/>
+          <w:bCs/>
+        </w:rPr>
+        <w:t>Objetivo General:</w:t>
+      </w:r>
+      <w:r>
+        <w:t xml:space="preserve"> Establecer la arquitectura base y el entorno de desarrollo automatizado para la plataforma digital </w:t>
+      </w:r>
+      <w:proofErr w:type="spellStart"/>
+      <w:r>
+        <w:t>MediSync</w:t>
+      </w:r>
+      <w:proofErr w:type="spellEnd"/>
+      <w:r>
+        <w:t xml:space="preserve"> Perú.</w:t>
+      </w:r>
+    </w:p>
+    <w:p>
+      <w:pPr>
+        <w:numPr>
+          <w:ilvl w:val="0"/>
+          <w:numId w:val="45"/>
+        </w:numPr>
+        <w:spacing w:after="0" w:line="480" w:lineRule="auto"/>
+        <w:jc w:val="both"/>
+      </w:pPr>
+      <w:r>
+        <w:rPr>
+          <w:b/>
+          <w:bCs/>
+        </w:rPr>
+        <w:t>Objetivos Específicos:</w:t>
+      </w:r>
+    </w:p>
+    <w:p>
+      <w:pPr>
+        <w:numPr>
+          <w:ilvl w:val="1"/>
+          <w:numId w:val="45"/>
+        </w:numPr>
+        <w:spacing w:after="0" w:line="480" w:lineRule="auto"/>
+        <w:jc w:val="both"/>
+      </w:pPr>
+      <w:r>
+        <w:t xml:space="preserve">Configurar la estructura del proyecto dividida en </w:t>
+      </w:r>
+      <w:proofErr w:type="spellStart"/>
+      <w:r>
+        <w:rPr>
+          <w:i/>
+          <w:iCs/>
+        </w:rPr>
+        <w:t>frontend</w:t>
+      </w:r>
+      <w:proofErr w:type="spellEnd"/>
+      <w:r>
+        <w:t xml:space="preserve"> y </w:t>
+      </w:r>
+      <w:proofErr w:type="spellStart"/>
+      <w:r>
+        <w:rPr>
+          <w:i/>
+          <w:iCs/>
+        </w:rPr>
+        <w:t>backend</w:t>
+      </w:r>
+      <w:proofErr w:type="spellEnd"/>
+      <w:r>
+        <w:t>.</w:t>
+      </w:r>
+    </w:p>
+    <w:p>
+      <w:pPr>
+        <w:numPr>
+          <w:ilvl w:val="1"/>
+          <w:numId w:val="45"/>
+        </w:numPr>
+        <w:spacing w:after="0" w:line="480" w:lineRule="auto"/>
+        <w:jc w:val="both"/>
+      </w:pPr>
+      <w:r>
+        <w:t xml:space="preserve">Implementar un sistema de diseño responsivo utilizando </w:t>
+      </w:r>
+      <w:proofErr w:type="spellStart"/>
+      <w:r>
+        <w:t>Tailwind</w:t>
+      </w:r>
+      <w:proofErr w:type="spellEnd"/>
+      <w:r>
+        <w:t xml:space="preserve"> CSS para la interfaz de usuario.</w:t>
+      </w:r>
+    </w:p>
+    <w:p>
+      <w:pPr>
+        <w:numPr>
+          <w:ilvl w:val="1"/>
+          <w:numId w:val="45"/>
+        </w:numPr>
+        <w:spacing w:after="0" w:line="480" w:lineRule="auto"/>
+        <w:jc w:val="both"/>
+      </w:pPr>
+      <w:r>
+        <w:t>Garantizar la calidad del código mediante la automatización de formateo y validación de sintaxis (DevOps/CI-CD local).</w:t>
+      </w:r>
+    </w:p>
+    <w:p>
+      <w:pPr>
+        <w:spacing w:after="0" w:line="480" w:lineRule="auto"/>
+        <w:jc w:val="both"/>
+        <w:rPr>
+          <w:b/>
+          <w:bCs/>
+        </w:rPr>
+      </w:pPr>
+      <w:r>
+        <w:rPr>
+          <w:b/>
+          <w:bCs/>
+        </w:rPr>
+        <w:t>Arquitectura general de la solución (Base inicial)</w:t>
+      </w:r>
+    </w:p>
+    <w:p>
+      <w:pPr>
+        <w:numPr>
+          <w:ilvl w:val="0"/>
+          <w:numId w:val="46"/>
+        </w:numPr>
+        <w:spacing w:after="0" w:line="480" w:lineRule="auto"/>
+        <w:jc w:val="both"/>
+      </w:pPr>
+      <w:r>
+        <w:rPr>
+          <w:b/>
+          <w:bCs/>
+        </w:rPr>
+        <w:lastRenderedPageBreak/>
+        <w:t>Estructura:</w:t>
+      </w:r>
+      <w:r>
+        <w:t xml:space="preserve"> Sistema basado en </w:t>
+      </w:r>
+      <w:proofErr w:type="spellStart"/>
+      <w:r>
+        <w:rPr>
+          <w:i/>
+          <w:iCs/>
+        </w:rPr>
+        <w:t>Monorepo</w:t>
+      </w:r>
+      <w:proofErr w:type="spellEnd"/>
+      <w:r>
+        <w:t xml:space="preserve"> (gestión de múltiples proyectos en un solo repositorio).</w:t>
+      </w:r>
+    </w:p>
+    <w:p>
+      <w:pPr>
+        <w:numPr>
+          <w:ilvl w:val="0"/>
+          <w:numId w:val="46"/>
+        </w:numPr>
+        <w:spacing w:after="0" w:line="480" w:lineRule="auto"/>
+        <w:jc w:val="both"/>
+      </w:pPr>
+      <w:proofErr w:type="spellStart"/>
+      <w:r>
+        <w:rPr>
+          <w:b/>
+          <w:bCs/>
+        </w:rPr>
+        <w:t>Frontend</w:t>
+      </w:r>
+      <w:proofErr w:type="spellEnd"/>
+      <w:r>
+        <w:rPr>
+          <w:b/>
+          <w:bCs/>
+        </w:rPr>
+        <w:t>:</w:t>
+      </w:r>
+      <w:r>
+        <w:t xml:space="preserve"> Construido con </w:t>
+      </w:r>
+      <w:proofErr w:type="spellStart"/>
+      <w:r>
+        <w:t>React</w:t>
+      </w:r>
+      <w:proofErr w:type="spellEnd"/>
+      <w:r>
+        <w:t xml:space="preserve">, </w:t>
+      </w:r>
+      <w:proofErr w:type="spellStart"/>
+      <w:r>
+        <w:t>TypeScript</w:t>
+      </w:r>
+      <w:proofErr w:type="spellEnd"/>
+      <w:r>
+        <w:t xml:space="preserve"> y Vite para renderizado ultrarrápido.</w:t>
+      </w:r>
+    </w:p>
+    <w:p>
+      <w:pPr>
+        <w:numPr>
+          <w:ilvl w:val="0"/>
+          <w:numId w:val="46"/>
+        </w:numPr>
+        <w:spacing w:after="0" w:line="480" w:lineRule="auto"/>
+        <w:jc w:val="both"/>
+      </w:pPr>
+      <w:r>
+        <w:rPr>
+          <w:b/>
+          <w:bCs/>
+        </w:rPr>
+        <w:t>Control de Versiones:</w:t>
+      </w:r>
+      <w:r>
+        <w:t xml:space="preserve"> Repositorio alojado en GitHub con políticas de validación estricta antes de la subida de código a la nube.</w:t>
+      </w:r>
+    </w:p>
+    <w:p>
+      <w:pPr>
+        <w:spacing w:after="0" w:line="480" w:lineRule="auto"/>
+        <w:jc w:val="both"/>
+        <w:rPr>
+          <w:b/>
+          <w:bCs/>
+        </w:rPr>
+      </w:pPr>
+      <w:r>
+        <w:rPr>
+          <w:b/>
+          <w:bCs/>
+        </w:rPr>
+        <w:t>Desarrollo técnico por componente</w:t>
+      </w:r>
+    </w:p>
+    <w:p>
+      <w:pPr>
+        <w:spacing w:after="0" w:line="480" w:lineRule="auto"/>
+        <w:jc w:val="both"/>
+      </w:pPr>
+      <w:r>
+        <w:rPr>
+          <w:b/>
+          <w:bCs/>
+        </w:rPr>
+        <w:t>1. Componente DevOps / CI-CD (Flujo de Integración Continua Local)</w:t>
+      </w:r>
+      <w:r>
+        <w:t xml:space="preserve"> Para esta primera fase, el desarrollo técnico se centró en la automatización y protección del código. Se implementó el siguiente </w:t>
+      </w:r>
+      <w:r>
+        <w:rPr>
+          <w:i/>
+          <w:iCs/>
+        </w:rPr>
+        <w:t>pipeline</w:t>
+      </w:r>
+      <w:r>
+        <w:t xml:space="preserve"> local:</w:t>
+      </w:r>
+    </w:p>
+    <w:p>
+      <w:pPr>
+        <w:numPr>
+          <w:ilvl w:val="0"/>
+          <w:numId w:val="47"/>
+        </w:numPr>
+        <w:spacing w:after="0" w:line="480" w:lineRule="auto"/>
+        <w:jc w:val="both"/>
+      </w:pPr>
+      <w:r>
+        <w:rPr>
+          <w:b/>
+          <w:bCs/>
+        </w:rPr>
+        <w:t>Estandarización de formato (</w:t>
+      </w:r>
+      <w:proofErr w:type="spellStart"/>
+      <w:r>
+        <w:rPr>
+          <w:b/>
+          <w:bCs/>
+        </w:rPr>
+        <w:t>Prettier</w:t>
+      </w:r>
+      <w:proofErr w:type="spellEnd"/>
+      <w:r>
+        <w:rPr>
+          <w:b/>
+          <w:bCs/>
+        </w:rPr>
+        <w:t>):</w:t>
+      </w:r>
+      <w:r>
+        <w:t xml:space="preserve"> Se </w:t>
+      </w:r>
+      <w:proofErr w:type="gramStart"/>
+      <w:r>
+        <w:t>configuró .</w:t>
+      </w:r>
+      <w:proofErr w:type="spellStart"/>
+      <w:r>
+        <w:t>prettierrc</w:t>
+      </w:r>
+      <w:proofErr w:type="spellEnd"/>
+      <w:proofErr w:type="gramEnd"/>
+      <w:r>
+        <w:t xml:space="preserve"> para unificar el estilo de escritura (</w:t>
+      </w:r>
+      <w:proofErr w:type="spellStart"/>
+      <w:r>
+        <w:t>indentación</w:t>
+      </w:r>
+      <w:proofErr w:type="spellEnd"/>
+      <w:r>
+        <w:t>, comillas, etc.) en todo el equipo de desarrollo.</w:t>
+      </w:r>
+    </w:p>
+    <w:p>
+      <w:pPr>
+        <w:numPr>
+          <w:ilvl w:val="0"/>
+          <w:numId w:val="47"/>
+        </w:numPr>
+        <w:spacing w:after="0" w:line="480" w:lineRule="auto"/>
+        <w:jc w:val="both"/>
+      </w:pPr>
+      <w:r>
+        <w:rPr>
+          <w:b/>
+          <w:bCs/>
+        </w:rPr>
+        <w:t>Análisis estático de código (</w:t>
+      </w:r>
+      <w:proofErr w:type="spellStart"/>
+      <w:r>
+        <w:rPr>
+          <w:b/>
+          <w:bCs/>
+        </w:rPr>
+        <w:t>ESLint</w:t>
+      </w:r>
+      <w:proofErr w:type="spellEnd"/>
+      <w:r>
+        <w:rPr>
+          <w:b/>
+          <w:bCs/>
+        </w:rPr>
+        <w:t>):</w:t>
+      </w:r>
+      <w:r>
+        <w:t xml:space="preserve"> Se implementó </w:t>
+      </w:r>
+      <w:r>
+        <w:rPr>
+          <w:i/>
+          <w:iCs/>
+        </w:rPr>
+        <w:t xml:space="preserve">Flat </w:t>
+      </w:r>
+      <w:proofErr w:type="spellStart"/>
+      <w:r>
+        <w:rPr>
+          <w:i/>
+          <w:iCs/>
+        </w:rPr>
+        <w:t>Config</w:t>
+      </w:r>
+      <w:proofErr w:type="spellEnd"/>
+      <w:r>
+        <w:t xml:space="preserve"> (eslint.config.js) con reglas estrictas de </w:t>
+      </w:r>
+      <w:proofErr w:type="spellStart"/>
+      <w:r>
+        <w:t>React</w:t>
+      </w:r>
+      <w:proofErr w:type="spellEnd"/>
+      <w:r>
+        <w:t xml:space="preserve"> y </w:t>
+      </w:r>
+      <w:proofErr w:type="spellStart"/>
+      <w:r>
+        <w:t>TypeScript</w:t>
+      </w:r>
+      <w:proofErr w:type="spellEnd"/>
+      <w:r>
+        <w:t xml:space="preserve"> para detectar errores lógicos antes de la compilación.</w:t>
+      </w:r>
+    </w:p>
+    <w:p>
+      <w:pPr>
+        <w:numPr>
+          <w:ilvl w:val="0"/>
+          <w:numId w:val="47"/>
+        </w:numPr>
+        <w:spacing w:after="0" w:line="480" w:lineRule="auto"/>
+        <w:jc w:val="both"/>
+      </w:pPr>
+      <w:r>
+        <w:rPr>
+          <w:b/>
+          <w:bCs/>
+        </w:rPr>
+        <w:t>Automatización con Husky (</w:t>
+      </w:r>
+      <w:proofErr w:type="spellStart"/>
+      <w:r>
+        <w:rPr>
+          <w:b/>
+          <w:bCs/>
+        </w:rPr>
+        <w:t>Pre-commit</w:t>
+      </w:r>
+      <w:proofErr w:type="spellEnd"/>
+      <w:r>
+        <w:rPr>
+          <w:b/>
+          <w:bCs/>
+        </w:rPr>
+        <w:t xml:space="preserve"> Hook):</w:t>
+      </w:r>
+      <w:r>
+        <w:t xml:space="preserve"> Se desarrolló un </w:t>
+      </w:r>
+      <w:r>
+        <w:rPr>
+          <w:i/>
+          <w:iCs/>
+        </w:rPr>
+        <w:t>script</w:t>
+      </w:r>
+      <w:r>
+        <w:t xml:space="preserve"> de automatización que intercepta cualquier intento de </w:t>
+      </w:r>
+      <w:proofErr w:type="spellStart"/>
+      <w:r>
+        <w:t>git</w:t>
+      </w:r>
+      <w:proofErr w:type="spellEnd"/>
+      <w:r>
+        <w:t xml:space="preserve"> </w:t>
+      </w:r>
+      <w:proofErr w:type="spellStart"/>
+      <w:r>
+        <w:t>commit</w:t>
+      </w:r>
+      <w:proofErr w:type="spellEnd"/>
+      <w:r>
+        <w:t xml:space="preserve">. Husky ejecuta obligatoriamente </w:t>
+      </w:r>
+      <w:proofErr w:type="spellStart"/>
+      <w:r>
+        <w:t>Prettier</w:t>
+      </w:r>
+      <w:proofErr w:type="spellEnd"/>
+      <w:r>
+        <w:t xml:space="preserve"> y </w:t>
+      </w:r>
+      <w:proofErr w:type="spellStart"/>
+      <w:r>
+        <w:t>ESLint</w:t>
+      </w:r>
+      <w:proofErr w:type="spellEnd"/>
+      <w:r>
+        <w:t xml:space="preserve">; si el código contiene errores o mal formato, el </w:t>
+      </w:r>
+      <w:proofErr w:type="spellStart"/>
+      <w:r>
+        <w:rPr>
+          <w:i/>
+          <w:iCs/>
+        </w:rPr>
+        <w:t>commit</w:t>
+      </w:r>
+      <w:proofErr w:type="spellEnd"/>
+      <w:r>
+        <w:t xml:space="preserve"> es bloqueado y rechazado automáticamente, asegurando que solo código funcional e impecable llegue al repositorio principal.</w:t>
+      </w:r>
+    </w:p>
+    <w:p>
+      <w:pPr>
+        <w:spacing w:after="0" w:line="480" w:lineRule="auto"/>
+        <w:jc w:val="both"/>
+        <w:rPr>
+          <w:b/>
+          <w:bCs/>
+        </w:rPr>
+      </w:pPr>
+      <w:r>
+        <w:rPr>
+          <w:b/>
+          <w:bCs/>
+        </w:rPr>
+        <w:t>Resultados obtenidos e indicadores de impacto</w:t>
+      </w:r>
+    </w:p>
+    <w:p>
+      <w:pPr>
+        <w:numPr>
+          <w:ilvl w:val="0"/>
+          <w:numId w:val="48"/>
+        </w:numPr>
+        <w:spacing w:after="0" w:line="480" w:lineRule="auto"/>
+        <w:jc w:val="both"/>
+      </w:pPr>
+      <w:r>
+        <w:rPr>
+          <w:b/>
+          <w:bCs/>
+        </w:rPr>
+        <w:lastRenderedPageBreak/>
+        <w:t>Eficiencia en el desarrollo:</w:t>
+      </w:r>
+      <w:r>
+        <w:t xml:space="preserve"> Reducción del 100% de errores de sintaxis y formato subidos al repositorio principal.</w:t>
+      </w:r>
+    </w:p>
+    <w:p>
+      <w:pPr>
+        <w:numPr>
+          <w:ilvl w:val="0"/>
+          <w:numId w:val="48"/>
+        </w:numPr>
+        <w:spacing w:after="0" w:line="480" w:lineRule="auto"/>
+        <w:jc w:val="both"/>
+      </w:pPr>
+      <w:r>
+        <w:rPr>
+          <w:b/>
+          <w:bCs/>
+        </w:rPr>
+        <w:t>Tiempo:</w:t>
+      </w:r>
+      <w:r>
+        <w:t xml:space="preserve"> El </w:t>
+      </w:r>
+      <w:r>
+        <w:rPr>
+          <w:i/>
+          <w:iCs/>
+        </w:rPr>
+        <w:t>script</w:t>
+      </w:r>
+      <w:r>
+        <w:t xml:space="preserve"> de Husky (</w:t>
+      </w:r>
+      <w:proofErr w:type="spellStart"/>
+      <w:r>
+        <w:t>pre-commit</w:t>
+      </w:r>
+      <w:proofErr w:type="spellEnd"/>
+      <w:r>
+        <w:t xml:space="preserve">) valida todo el código del </w:t>
+      </w:r>
+      <w:proofErr w:type="spellStart"/>
+      <w:r>
+        <w:rPr>
+          <w:i/>
+          <w:iCs/>
+        </w:rPr>
+        <w:t>frontend</w:t>
+      </w:r>
+      <w:proofErr w:type="spellEnd"/>
+      <w:r>
+        <w:t xml:space="preserve"> en un promedio de milisegundos (como se evidenció en las pruebas de consola), sin ralentizar el flujo de trabajo del desarrollador.</w:t>
+      </w:r>
+    </w:p>
+    <w:p>
+      <w:pPr>
+        <w:spacing w:after="0" w:line="480" w:lineRule="auto"/>
+        <w:jc w:val="both"/>
+        <w:rPr>
+          <w:b/>
+          <w:bCs/>
+        </w:rPr>
+      </w:pPr>
+      <w:r>
+        <w:rPr>
+          <w:b/>
+          <w:bCs/>
+        </w:rPr>
+        <w:t>Conclusiones, limitaciones y trabajo futuro</w:t>
+      </w:r>
+    </w:p>
+    <w:p>
+      <w:pPr>
+        <w:numPr>
+          <w:ilvl w:val="0"/>
+          <w:numId w:val="49"/>
+        </w:numPr>
+        <w:spacing w:after="0" w:line="480" w:lineRule="auto"/>
+        <w:jc w:val="both"/>
+      </w:pPr>
+      <w:r>
+        <w:rPr>
+          <w:b/>
+          <w:bCs/>
+        </w:rPr>
+        <w:t>Conclusiones:</w:t>
+      </w:r>
+      <w:r>
+        <w:t xml:space="preserve"> La implementación de Husky y </w:t>
+      </w:r>
+      <w:proofErr w:type="spellStart"/>
+      <w:r>
+        <w:t>linters</w:t>
+      </w:r>
+      <w:proofErr w:type="spellEnd"/>
+      <w:r>
+        <w:t xml:space="preserve"> desde el inicio separa un proyecto académico de uno profesional. La base de </w:t>
+      </w:r>
+      <w:proofErr w:type="spellStart"/>
+      <w:r>
+        <w:t>MediSync</w:t>
+      </w:r>
+      <w:proofErr w:type="spellEnd"/>
+      <w:r>
+        <w:t xml:space="preserve"> ahora es inmune a errores de código por descuidos humanos.</w:t>
+      </w:r>
+    </w:p>
+    <w:p>
+      <w:pPr>
+        <w:numPr>
+          <w:ilvl w:val="0"/>
+          <w:numId w:val="49"/>
+        </w:numPr>
+        <w:spacing w:after="0" w:line="480" w:lineRule="auto"/>
+        <w:jc w:val="both"/>
+      </w:pPr>
+      <w:r>
+        <w:rPr>
+          <w:b/>
+          <w:bCs/>
+        </w:rPr>
+        <w:t>Limitaciones (Fase 1):</w:t>
+      </w:r>
+      <w:r>
+        <w:t xml:space="preserve"> Actualmente, el sistema cuenta con la interfaz de usuario y las reglas de seguridad de código, pero aún carece de un servidor </w:t>
+      </w:r>
+      <w:proofErr w:type="spellStart"/>
+      <w:r>
+        <w:rPr>
+          <w:i/>
+          <w:iCs/>
+        </w:rPr>
+        <w:t>backend</w:t>
+      </w:r>
+      <w:proofErr w:type="spellEnd"/>
+      <w:r>
+        <w:t xml:space="preserve"> funcional y de una base de datos conectada.</w:t>
+      </w:r>
+    </w:p>
+    <w:p>
+      <w:pPr>
+        <w:numPr>
+          <w:ilvl w:val="0"/>
+          <w:numId w:val="49"/>
+        </w:numPr>
+        <w:spacing w:after="0" w:line="480" w:lineRule="auto"/>
+        <w:jc w:val="both"/>
+      </w:pPr>
+      <w:r>
+        <w:rPr>
+          <w:b/>
+          <w:bCs/>
+        </w:rPr>
+        <w:t>Trabajo Futuro:</w:t>
+      </w:r>
+      <w:r>
+        <w:t xml:space="preserve"> El entorno está listo para pasar al desarrollo de la API (</w:t>
+      </w:r>
+      <w:proofErr w:type="spellStart"/>
+      <w:r>
+        <w:rPr>
+          <w:i/>
+          <w:iCs/>
+        </w:rPr>
+        <w:t>backend</w:t>
+      </w:r>
+      <w:proofErr w:type="spellEnd"/>
+      <w:r>
+        <w:t xml:space="preserve"> con Express) y a la integración del Motor de Inteligencia Artificial.</w:t>
+      </w:r>
+    </w:p>
+    <w:p>
+      <w:pPr>
+        <w:spacing w:after="0" w:line="480" w:lineRule="auto"/>
+        <w:jc w:val="both"/>
+        <w:rPr>
+          <w:b/>
+          <w:bCs/>
+        </w:rPr>
+      </w:pPr>
+      <w:r>
+        <w:rPr>
+          <w:b/>
+          <w:bCs/>
+        </w:rPr>
+        <w:t>Anexos</w:t>
+      </w:r>
+    </w:p>
+    <w:p>
+      <w:pPr>
+        <w:numPr>
+          <w:ilvl w:val="0"/>
+          <w:numId w:val="50"/>
+        </w:numPr>
+        <w:spacing w:after="0" w:line="480" w:lineRule="auto"/>
+      </w:pPr>
+      <w:r>
+        <w:t>Enlace al repositorio de GitHub</w:t>
+      </w:r>
+      <w:r>
+        <w:t xml:space="preserve">: </w:t>
       </w:r>
       <w:hyperlink r:id="rId8" w:history="1">
         <w:r>
           <w:rPr>
             <w:rStyle w:val="Hyperlink"/>
           </w:rPr>
-          <w:t>https://youtu.be/zMTU_5Fw60s</w:t>
+          <w:t>https://github.com/MSanchezVasquez/medisync-clinica-digital</w:t>
         </w:r>
       </w:hyperlink>
+    </w:p>
+    <w:p>
+      <w:pPr>
+        <w:spacing w:after="0" w:line="480" w:lineRule="auto"/>
+      </w:pPr>
+      <w:r>
+        <w:rPr>
+          <w:noProof/>
+        </w:rPr>
+        <w:lastRenderedPageBreak/>
+        <w:drawing>
+          <wp:inline distT="0" distB="0" distL="0" distR="0" wp14:anchorId="04247062" wp14:editId="0D19A954">
+            <wp:extent cx="5394960" cy="3017520"/>
+            <wp:effectExtent l="0" t="0" r="0" b="0"/>
+            <wp:docPr id="1744144203" name="Picture 1"/>
+            <wp:cNvGraphicFramePr>
+              <a:graphicFrameLocks xmlns:a="http://schemas.openxmlformats.org/drawingml/2006/main" noChangeAspect="1"/>
+            </wp:cNvGraphicFramePr>
+            <a:graphic xmlns:a="http://schemas.openxmlformats.org/drawingml/2006/main">
+              <a:graphicData uri="http://schemas.openxmlformats.org/drawingml/2006/picture">
+                <pic:pic xmlns:pic="http://schemas.openxmlformats.org/drawingml/2006/picture">
+                  <pic:nvPicPr>
+                    <pic:cNvPr id="0" name="Picture 1"/>
+                    <pic:cNvPicPr>
+                      <a:picLocks noChangeAspect="1" noChangeArrowheads="1"/>
+                    </pic:cNvPicPr>
+                  </pic:nvPicPr>
+                  <pic:blipFill rotWithShape="1">
+                    <a:blip r:embed="rId9">
+                      <a:extLst>
+                        <a:ext uri="{28A0092B-C50C-407E-A947-70E740481C1C}">
+                          <a14:useLocalDpi xmlns:a14="http://schemas.microsoft.com/office/drawing/2010/main" val="0"/>
+                        </a:ext>
+                      </a:extLst>
+                    </a:blip>
+                    <a:srcRect t="48099"/>
+                    <a:stretch>
+                      <a:fillRect/>
+                    </a:stretch>
+                  </pic:blipFill>
+                  <pic:spPr bwMode="auto">
+                    <a:xfrm>
+                      <a:off x="0" y="0"/>
+                      <a:ext cx="5394960" cy="3017520"/>
+                    </a:xfrm>
+                    <a:prstGeom prst="rect">
+                      <a:avLst/>
+                    </a:prstGeom>
+                    <a:noFill/>
+                    <a:ln>
+                      <a:noFill/>
+                    </a:ln>
+                    <a:extLst>
+                      <a:ext uri="{53640926-AAD7-44D8-BBD7-CCE9431645EC}">
+                        <a14:shadowObscured xmlns:a14="http://schemas.microsoft.com/office/drawing/2010/main"/>
+                      </a:ext>
+                    </a:extLst>
+                  </pic:spPr>
+                </pic:pic>
+              </a:graphicData>
+            </a:graphic>
+          </wp:inline>
+        </w:drawing>
+      </w:r>
+    </w:p>
+    <w:p>
+      <w:pPr>
+        <w:spacing w:after="0" w:line="480" w:lineRule="auto"/>
+      </w:pPr>
+      <w:r>
+        <w:rPr>
+          <w:noProof/>
+        </w:rPr>
+        <w:drawing>
+          <wp:inline distT="0" distB="0" distL="0" distR="0" wp14:anchorId="3B8B0588" wp14:editId="7F0FC19C">
+            <wp:extent cx="5394960" cy="2407920"/>
+            <wp:effectExtent l="0" t="0" r="0" b="0"/>
+            <wp:docPr id="784452112" name="Picture 2"/>
+            <wp:cNvGraphicFramePr>
+              <a:graphicFrameLocks xmlns:a="http://schemas.openxmlformats.org/drawingml/2006/main" noChangeAspect="1"/>
+            </wp:cNvGraphicFramePr>
+            <a:graphic xmlns:a="http://schemas.openxmlformats.org/drawingml/2006/main">
+              <a:graphicData uri="http://schemas.openxmlformats.org/drawingml/2006/picture">
+                <pic:pic xmlns:pic="http://schemas.openxmlformats.org/drawingml/2006/picture">
+                  <pic:nvPicPr>
+                    <pic:cNvPr id="0" name="Picture 2"/>
+                    <pic:cNvPicPr>
+                      <a:picLocks noChangeAspect="1" noChangeArrowheads="1"/>
+                    </pic:cNvPicPr>
+                  </pic:nvPicPr>
+                  <pic:blipFill>
+                    <a:blip r:embed="rId10">
+                      <a:extLst>
+                        <a:ext uri="{28A0092B-C50C-407E-A947-70E740481C1C}">
+                          <a14:useLocalDpi xmlns:a14="http://schemas.microsoft.com/office/drawing/2010/main" val="0"/>
+                        </a:ext>
+                      </a:extLst>
+                    </a:blip>
+                    <a:srcRect/>
+                    <a:stretch>
+                      <a:fillRect/>
+                    </a:stretch>
+                  </pic:blipFill>
+                  <pic:spPr bwMode="auto">
+                    <a:xfrm>
+                      <a:off x="0" y="0"/>
+                      <a:ext cx="5394960" cy="2407920"/>
+                    </a:xfrm>
+                    <a:prstGeom prst="rect">
+                      <a:avLst/>
+                    </a:prstGeom>
+                    <a:noFill/>
+                    <a:ln>
+                      <a:noFill/>
+                    </a:ln>
+                  </pic:spPr>
+                </pic:pic>
+              </a:graphicData>
+            </a:graphic>
+          </wp:inline>
+        </w:drawing>
+      </w:r>
     </w:p>
     <w:p>
       <w:pPr>
@@ -1807,6 +2965,155 @@
     </w:lvl>
   </w:abstractNum>
   <w:abstractNum w:abstractNumId="12" w15:restartNumberingAfterBreak="0">
+    <w:nsid w:val="19BB5F4F"/>
+    <w:multiLevelType w:val="multilevel"/>
+    <w:tmpl w:val="5694F69A"/>
+    <w:lvl w:ilvl="0">
+      <w:start w:val="1"/>
+      <w:numFmt w:val="bullet"/>
+      <w:lvlText w:val=""/>
+      <w:lvlJc w:val="left"/>
+      <w:pPr>
+        <w:tabs>
+          <w:tab w:val="num" w:pos="720"/>
+        </w:tabs>
+        <w:ind w:left="720" w:hanging="360"/>
+      </w:pPr>
+      <w:rPr>
+        <w:rFonts w:ascii="Symbol" w:hAnsi="Symbol" w:hint="default"/>
+        <w:sz w:val="20"/>
+      </w:rPr>
+    </w:lvl>
+    <w:lvl w:ilvl="1" w:tentative="1">
+      <w:start w:val="1"/>
+      <w:numFmt w:val="bullet"/>
+      <w:lvlText w:val="o"/>
+      <w:lvlJc w:val="left"/>
+      <w:pPr>
+        <w:tabs>
+          <w:tab w:val="num" w:pos="1440"/>
+        </w:tabs>
+        <w:ind w:left="1440" w:hanging="360"/>
+      </w:pPr>
+      <w:rPr>
+        <w:rFonts w:ascii="Courier New" w:hAnsi="Courier New" w:hint="default"/>
+        <w:sz w:val="20"/>
+      </w:rPr>
+    </w:lvl>
+    <w:lvl w:ilvl="2" w:tentative="1">
+      <w:start w:val="1"/>
+      <w:numFmt w:val="bullet"/>
+      <w:lvlText w:val=""/>
+      <w:lvlJc w:val="left"/>
+      <w:pPr>
+        <w:tabs>
+          <w:tab w:val="num" w:pos="2160"/>
+        </w:tabs>
+        <w:ind w:left="2160" w:hanging="360"/>
+      </w:pPr>
+      <w:rPr>
+        <w:rFonts w:ascii="Wingdings" w:hAnsi="Wingdings" w:hint="default"/>
+        <w:sz w:val="20"/>
+      </w:rPr>
+    </w:lvl>
+    <w:lvl w:ilvl="3" w:tentative="1">
+      <w:start w:val="1"/>
+      <w:numFmt w:val="bullet"/>
+      <w:lvlText w:val=""/>
+      <w:lvlJc w:val="left"/>
+      <w:pPr>
+        <w:tabs>
+          <w:tab w:val="num" w:pos="2880"/>
+        </w:tabs>
+        <w:ind w:left="2880" w:hanging="360"/>
+      </w:pPr>
+      <w:rPr>
+        <w:rFonts w:ascii="Wingdings" w:hAnsi="Wingdings" w:hint="default"/>
+        <w:sz w:val="20"/>
+      </w:rPr>
+    </w:lvl>
+    <w:lvl w:ilvl="4" w:tentative="1">
+      <w:start w:val="1"/>
+      <w:numFmt w:val="bullet"/>
+      <w:lvlText w:val=""/>
+      <w:lvlJc w:val="left"/>
+      <w:pPr>
+        <w:tabs>
+          <w:tab w:val="num" w:pos="3600"/>
+        </w:tabs>
+        <w:ind w:left="3600" w:hanging="360"/>
+      </w:pPr>
+      <w:rPr>
+        <w:rFonts w:ascii="Wingdings" w:hAnsi="Wingdings" w:hint="default"/>
+        <w:sz w:val="20"/>
+      </w:rPr>
+    </w:lvl>
+    <w:lvl w:ilvl="5" w:tentative="1">
+      <w:start w:val="1"/>
+      <w:numFmt w:val="bullet"/>
+      <w:lvlText w:val=""/>
+      <w:lvlJc w:val="left"/>
+      <w:pPr>
+        <w:tabs>
+          <w:tab w:val="num" w:pos="4320"/>
+        </w:tabs>
+        <w:ind w:left="4320" w:hanging="360"/>
+      </w:pPr>
+      <w:rPr>
+        <w:rFonts w:ascii="Wingdings" w:hAnsi="Wingdings" w:hint="default"/>
+        <w:sz w:val="20"/>
+      </w:rPr>
+    </w:lvl>
+    <w:lvl w:ilvl="6" w:tentative="1">
+      <w:start w:val="1"/>
+      <w:numFmt w:val="bullet"/>
+      <w:lvlText w:val=""/>
+      <w:lvlJc w:val="left"/>
+      <w:pPr>
+        <w:tabs>
+          <w:tab w:val="num" w:pos="5040"/>
+        </w:tabs>
+        <w:ind w:left="5040" w:hanging="360"/>
+      </w:pPr>
+      <w:rPr>
+        <w:rFonts w:ascii="Wingdings" w:hAnsi="Wingdings" w:hint="default"/>
+        <w:sz w:val="20"/>
+      </w:rPr>
+    </w:lvl>
+    <w:lvl w:ilvl="7" w:tentative="1">
+      <w:start w:val="1"/>
+      <w:numFmt w:val="bullet"/>
+      <w:lvlText w:val=""/>
+      <w:lvlJc w:val="left"/>
+      <w:pPr>
+        <w:tabs>
+          <w:tab w:val="num" w:pos="5760"/>
+        </w:tabs>
+        <w:ind w:left="5760" w:hanging="360"/>
+      </w:pPr>
+      <w:rPr>
+        <w:rFonts w:ascii="Wingdings" w:hAnsi="Wingdings" w:hint="default"/>
+        <w:sz w:val="20"/>
+      </w:rPr>
+    </w:lvl>
+    <w:lvl w:ilvl="8" w:tentative="1">
+      <w:start w:val="1"/>
+      <w:numFmt w:val="bullet"/>
+      <w:lvlText w:val=""/>
+      <w:lvlJc w:val="left"/>
+      <w:pPr>
+        <w:tabs>
+          <w:tab w:val="num" w:pos="6480"/>
+        </w:tabs>
+        <w:ind w:left="6480" w:hanging="360"/>
+      </w:pPr>
+      <w:rPr>
+        <w:rFonts w:ascii="Wingdings" w:hAnsi="Wingdings" w:hint="default"/>
+        <w:sz w:val="20"/>
+      </w:rPr>
+    </w:lvl>
+  </w:abstractNum>
+  <w:abstractNum w:abstractNumId="13" w15:restartNumberingAfterBreak="0">
     <w:nsid w:val="1A654414"/>
     <w:multiLevelType w:val="hybridMultilevel"/>
     <w:tmpl w:val="E34C9650"/>
@@ -1919,7 +3226,7 @@
       </w:rPr>
     </w:lvl>
   </w:abstractNum>
-  <w:abstractNum w:abstractNumId="13" w15:restartNumberingAfterBreak="0">
+  <w:abstractNum w:abstractNumId="14" w15:restartNumberingAfterBreak="0">
     <w:nsid w:val="1B3451AB"/>
     <w:multiLevelType w:val="hybridMultilevel"/>
     <w:tmpl w:val="850A3372"/>
@@ -2032,7 +3339,7 @@
       </w:rPr>
     </w:lvl>
   </w:abstractNum>
-  <w:abstractNum w:abstractNumId="14" w15:restartNumberingAfterBreak="0">
+  <w:abstractNum w:abstractNumId="15" w15:restartNumberingAfterBreak="0">
     <w:nsid w:val="208B3ED1"/>
     <w:multiLevelType w:val="multilevel"/>
     <w:tmpl w:val="145E9DA0"/>
@@ -2145,7 +3452,156 @@
       </w:rPr>
     </w:lvl>
   </w:abstractNum>
-  <w:abstractNum w:abstractNumId="15" w15:restartNumberingAfterBreak="0">
+  <w:abstractNum w:abstractNumId="16" w15:restartNumberingAfterBreak="0">
+    <w:nsid w:val="213D6BEE"/>
+    <w:multiLevelType w:val="multilevel"/>
+    <w:tmpl w:val="9D567EF6"/>
+    <w:lvl w:ilvl="0">
+      <w:start w:val="1"/>
+      <w:numFmt w:val="bullet"/>
+      <w:lvlText w:val=""/>
+      <w:lvlJc w:val="left"/>
+      <w:pPr>
+        <w:tabs>
+          <w:tab w:val="num" w:pos="720"/>
+        </w:tabs>
+        <w:ind w:left="720" w:hanging="360"/>
+      </w:pPr>
+      <w:rPr>
+        <w:rFonts w:ascii="Symbol" w:hAnsi="Symbol" w:hint="default"/>
+        <w:sz w:val="20"/>
+      </w:rPr>
+    </w:lvl>
+    <w:lvl w:ilvl="1" w:tentative="1">
+      <w:start w:val="1"/>
+      <w:numFmt w:val="bullet"/>
+      <w:lvlText w:val="o"/>
+      <w:lvlJc w:val="left"/>
+      <w:pPr>
+        <w:tabs>
+          <w:tab w:val="num" w:pos="1440"/>
+        </w:tabs>
+        <w:ind w:left="1440" w:hanging="360"/>
+      </w:pPr>
+      <w:rPr>
+        <w:rFonts w:ascii="Courier New" w:hAnsi="Courier New" w:hint="default"/>
+        <w:sz w:val="20"/>
+      </w:rPr>
+    </w:lvl>
+    <w:lvl w:ilvl="2" w:tentative="1">
+      <w:start w:val="1"/>
+      <w:numFmt w:val="bullet"/>
+      <w:lvlText w:val=""/>
+      <w:lvlJc w:val="left"/>
+      <w:pPr>
+        <w:tabs>
+          <w:tab w:val="num" w:pos="2160"/>
+        </w:tabs>
+        <w:ind w:left="2160" w:hanging="360"/>
+      </w:pPr>
+      <w:rPr>
+        <w:rFonts w:ascii="Wingdings" w:hAnsi="Wingdings" w:hint="default"/>
+        <w:sz w:val="20"/>
+      </w:rPr>
+    </w:lvl>
+    <w:lvl w:ilvl="3" w:tentative="1">
+      <w:start w:val="1"/>
+      <w:numFmt w:val="bullet"/>
+      <w:lvlText w:val=""/>
+      <w:lvlJc w:val="left"/>
+      <w:pPr>
+        <w:tabs>
+          <w:tab w:val="num" w:pos="2880"/>
+        </w:tabs>
+        <w:ind w:left="2880" w:hanging="360"/>
+      </w:pPr>
+      <w:rPr>
+        <w:rFonts w:ascii="Wingdings" w:hAnsi="Wingdings" w:hint="default"/>
+        <w:sz w:val="20"/>
+      </w:rPr>
+    </w:lvl>
+    <w:lvl w:ilvl="4" w:tentative="1">
+      <w:start w:val="1"/>
+      <w:numFmt w:val="bullet"/>
+      <w:lvlText w:val=""/>
+      <w:lvlJc w:val="left"/>
+      <w:pPr>
+        <w:tabs>
+          <w:tab w:val="num" w:pos="3600"/>
+        </w:tabs>
+        <w:ind w:left="3600" w:hanging="360"/>
+      </w:pPr>
+      <w:rPr>
+        <w:rFonts w:ascii="Wingdings" w:hAnsi="Wingdings" w:hint="default"/>
+        <w:sz w:val="20"/>
+      </w:rPr>
+    </w:lvl>
+    <w:lvl w:ilvl="5" w:tentative="1">
+      <w:start w:val="1"/>
+      <w:numFmt w:val="bullet"/>
+      <w:lvlText w:val=""/>
+      <w:lvlJc w:val="left"/>
+      <w:pPr>
+        <w:tabs>
+          <w:tab w:val="num" w:pos="4320"/>
+        </w:tabs>
+        <w:ind w:left="4320" w:hanging="360"/>
+      </w:pPr>
+      <w:rPr>
+        <w:rFonts w:ascii="Wingdings" w:hAnsi="Wingdings" w:hint="default"/>
+        <w:sz w:val="20"/>
+      </w:rPr>
+    </w:lvl>
+    <w:lvl w:ilvl="6" w:tentative="1">
+      <w:start w:val="1"/>
+      <w:numFmt w:val="bullet"/>
+      <w:lvlText w:val=""/>
+      <w:lvlJc w:val="left"/>
+      <w:pPr>
+        <w:tabs>
+          <w:tab w:val="num" w:pos="5040"/>
+        </w:tabs>
+        <w:ind w:left="5040" w:hanging="360"/>
+      </w:pPr>
+      <w:rPr>
+        <w:rFonts w:ascii="Wingdings" w:hAnsi="Wingdings" w:hint="default"/>
+        <w:sz w:val="20"/>
+      </w:rPr>
+    </w:lvl>
+    <w:lvl w:ilvl="7" w:tentative="1">
+      <w:start w:val="1"/>
+      <w:numFmt w:val="bullet"/>
+      <w:lvlText w:val=""/>
+      <w:lvlJc w:val="left"/>
+      <w:pPr>
+        <w:tabs>
+          <w:tab w:val="num" w:pos="5760"/>
+        </w:tabs>
+        <w:ind w:left="5760" w:hanging="360"/>
+      </w:pPr>
+      <w:rPr>
+        <w:rFonts w:ascii="Wingdings" w:hAnsi="Wingdings" w:hint="default"/>
+        <w:sz w:val="20"/>
+      </w:rPr>
+    </w:lvl>
+    <w:lvl w:ilvl="8" w:tentative="1">
+      <w:start w:val="1"/>
+      <w:numFmt w:val="bullet"/>
+      <w:lvlText w:val=""/>
+      <w:lvlJc w:val="left"/>
+      <w:pPr>
+        <w:tabs>
+          <w:tab w:val="num" w:pos="6480"/>
+        </w:tabs>
+        <w:ind w:left="6480" w:hanging="360"/>
+      </w:pPr>
+      <w:rPr>
+        <w:rFonts w:ascii="Wingdings" w:hAnsi="Wingdings" w:hint="default"/>
+        <w:sz w:val="20"/>
+      </w:rPr>
+    </w:lvl>
+  </w:abstractNum>
+  <w:abstractNum w:abstractNumId="17" w15:restartNumberingAfterBreak="0">
     <w:nsid w:val="229E2EB6"/>
     <w:multiLevelType w:val="hybridMultilevel"/>
     <w:tmpl w:val="ACE4283E"/>
@@ -2235,7 +3691,7 @@
       </w:pPr>
     </w:lvl>
   </w:abstractNum>
-  <w:abstractNum w:abstractNumId="16" w15:restartNumberingAfterBreak="0">
+  <w:abstractNum w:abstractNumId="18" w15:restartNumberingAfterBreak="0">
     <w:nsid w:val="22BF2332"/>
     <w:multiLevelType w:val="multilevel"/>
     <w:tmpl w:val="B67670D0"/>
@@ -2348,7 +3804,7 @@
       </w:rPr>
     </w:lvl>
   </w:abstractNum>
-  <w:abstractNum w:abstractNumId="17" w15:restartNumberingAfterBreak="0">
+  <w:abstractNum w:abstractNumId="19" w15:restartNumberingAfterBreak="0">
     <w:nsid w:val="233D1F8D"/>
     <w:multiLevelType w:val="multilevel"/>
     <w:tmpl w:val="4224D3B4"/>
@@ -2461,7 +3917,7 @@
       </w:rPr>
     </w:lvl>
   </w:abstractNum>
-  <w:abstractNum w:abstractNumId="18" w15:restartNumberingAfterBreak="0">
+  <w:abstractNum w:abstractNumId="20" w15:restartNumberingAfterBreak="0">
     <w:nsid w:val="23A05C6E"/>
     <w:multiLevelType w:val="multilevel"/>
     <w:tmpl w:val="3F065C6A"/>
@@ -2574,7 +4030,7 @@
       </w:rPr>
     </w:lvl>
   </w:abstractNum>
-  <w:abstractNum w:abstractNumId="19" w15:restartNumberingAfterBreak="0">
+  <w:abstractNum w:abstractNumId="21" w15:restartNumberingAfterBreak="0">
     <w:nsid w:val="2A18032F"/>
     <w:multiLevelType w:val="multilevel"/>
     <w:tmpl w:val="85D4B83C"/>
@@ -2687,7 +4143,156 @@
       </w:rPr>
     </w:lvl>
   </w:abstractNum>
-  <w:abstractNum w:abstractNumId="20" w15:restartNumberingAfterBreak="0">
+  <w:abstractNum w:abstractNumId="22" w15:restartNumberingAfterBreak="0">
+    <w:nsid w:val="2CC426F5"/>
+    <w:multiLevelType w:val="multilevel"/>
+    <w:tmpl w:val="7EF2A8B4"/>
+    <w:lvl w:ilvl="0">
+      <w:start w:val="1"/>
+      <w:numFmt w:val="bullet"/>
+      <w:lvlText w:val=""/>
+      <w:lvlJc w:val="left"/>
+      <w:pPr>
+        <w:tabs>
+          <w:tab w:val="num" w:pos="720"/>
+        </w:tabs>
+        <w:ind w:left="720" w:hanging="360"/>
+      </w:pPr>
+      <w:rPr>
+        <w:rFonts w:ascii="Symbol" w:hAnsi="Symbol" w:hint="default"/>
+        <w:sz w:val="20"/>
+      </w:rPr>
+    </w:lvl>
+    <w:lvl w:ilvl="1" w:tentative="1">
+      <w:start w:val="1"/>
+      <w:numFmt w:val="bullet"/>
+      <w:lvlText w:val="o"/>
+      <w:lvlJc w:val="left"/>
+      <w:pPr>
+        <w:tabs>
+          <w:tab w:val="num" w:pos="1440"/>
+        </w:tabs>
+        <w:ind w:left="1440" w:hanging="360"/>
+      </w:pPr>
+      <w:rPr>
+        <w:rFonts w:ascii="Courier New" w:hAnsi="Courier New" w:hint="default"/>
+        <w:sz w:val="20"/>
+      </w:rPr>
+    </w:lvl>
+    <w:lvl w:ilvl="2" w:tentative="1">
+      <w:start w:val="1"/>
+      <w:numFmt w:val="bullet"/>
+      <w:lvlText w:val=""/>
+      <w:lvlJc w:val="left"/>
+      <w:pPr>
+        <w:tabs>
+          <w:tab w:val="num" w:pos="2160"/>
+        </w:tabs>
+        <w:ind w:left="2160" w:hanging="360"/>
+      </w:pPr>
+      <w:rPr>
+        <w:rFonts w:ascii="Wingdings" w:hAnsi="Wingdings" w:hint="default"/>
+        <w:sz w:val="20"/>
+      </w:rPr>
+    </w:lvl>
+    <w:lvl w:ilvl="3" w:tentative="1">
+      <w:start w:val="1"/>
+      <w:numFmt w:val="bullet"/>
+      <w:lvlText w:val=""/>
+      <w:lvlJc w:val="left"/>
+      <w:pPr>
+        <w:tabs>
+          <w:tab w:val="num" w:pos="2880"/>
+        </w:tabs>
+        <w:ind w:left="2880" w:hanging="360"/>
+      </w:pPr>
+      <w:rPr>
+        <w:rFonts w:ascii="Wingdings" w:hAnsi="Wingdings" w:hint="default"/>
+        <w:sz w:val="20"/>
+      </w:rPr>
+    </w:lvl>
+    <w:lvl w:ilvl="4" w:tentative="1">
+      <w:start w:val="1"/>
+      <w:numFmt w:val="bullet"/>
+      <w:lvlText w:val=""/>
+      <w:lvlJc w:val="left"/>
+      <w:pPr>
+        <w:tabs>
+          <w:tab w:val="num" w:pos="3600"/>
+        </w:tabs>
+        <w:ind w:left="3600" w:hanging="360"/>
+      </w:pPr>
+      <w:rPr>
+        <w:rFonts w:ascii="Wingdings" w:hAnsi="Wingdings" w:hint="default"/>
+        <w:sz w:val="20"/>
+      </w:rPr>
+    </w:lvl>
+    <w:lvl w:ilvl="5" w:tentative="1">
+      <w:start w:val="1"/>
+      <w:numFmt w:val="bullet"/>
+      <w:lvlText w:val=""/>
+      <w:lvlJc w:val="left"/>
+      <w:pPr>
+        <w:tabs>
+          <w:tab w:val="num" w:pos="4320"/>
+        </w:tabs>
+        <w:ind w:left="4320" w:hanging="360"/>
+      </w:pPr>
+      <w:rPr>
+        <w:rFonts w:ascii="Wingdings" w:hAnsi="Wingdings" w:hint="default"/>
+        <w:sz w:val="20"/>
+      </w:rPr>
+    </w:lvl>
+    <w:lvl w:ilvl="6" w:tentative="1">
+      <w:start w:val="1"/>
+      <w:numFmt w:val="bullet"/>
+      <w:lvlText w:val=""/>
+      <w:lvlJc w:val="left"/>
+      <w:pPr>
+        <w:tabs>
+          <w:tab w:val="num" w:pos="5040"/>
+        </w:tabs>
+        <w:ind w:left="5040" w:hanging="360"/>
+      </w:pPr>
+      <w:rPr>
+        <w:rFonts w:ascii="Wingdings" w:hAnsi="Wingdings" w:hint="default"/>
+        <w:sz w:val="20"/>
+      </w:rPr>
+    </w:lvl>
+    <w:lvl w:ilvl="7" w:tentative="1">
+      <w:start w:val="1"/>
+      <w:numFmt w:val="bullet"/>
+      <w:lvlText w:val=""/>
+      <w:lvlJc w:val="left"/>
+      <w:pPr>
+        <w:tabs>
+          <w:tab w:val="num" w:pos="5760"/>
+        </w:tabs>
+        <w:ind w:left="5760" w:hanging="360"/>
+      </w:pPr>
+      <w:rPr>
+        <w:rFonts w:ascii="Wingdings" w:hAnsi="Wingdings" w:hint="default"/>
+        <w:sz w:val="20"/>
+      </w:rPr>
+    </w:lvl>
+    <w:lvl w:ilvl="8" w:tentative="1">
+      <w:start w:val="1"/>
+      <w:numFmt w:val="bullet"/>
+      <w:lvlText w:val=""/>
+      <w:lvlJc w:val="left"/>
+      <w:pPr>
+        <w:tabs>
+          <w:tab w:val="num" w:pos="6480"/>
+        </w:tabs>
+        <w:ind w:left="6480" w:hanging="360"/>
+      </w:pPr>
+      <w:rPr>
+        <w:rFonts w:ascii="Wingdings" w:hAnsi="Wingdings" w:hint="default"/>
+        <w:sz w:val="20"/>
+      </w:rPr>
+    </w:lvl>
+  </w:abstractNum>
+  <w:abstractNum w:abstractNumId="23" w15:restartNumberingAfterBreak="0">
     <w:nsid w:val="3B2D62C3"/>
     <w:multiLevelType w:val="hybridMultilevel"/>
     <w:tmpl w:val="181E945C"/>
@@ -2800,7 +4405,7 @@
       </w:rPr>
     </w:lvl>
   </w:abstractNum>
-  <w:abstractNum w:abstractNumId="21" w15:restartNumberingAfterBreak="0">
+  <w:abstractNum w:abstractNumId="24" w15:restartNumberingAfterBreak="0">
     <w:nsid w:val="3BB13955"/>
     <w:multiLevelType w:val="hybridMultilevel"/>
     <w:tmpl w:val="44387444"/>
@@ -2913,7 +4518,7 @@
       </w:rPr>
     </w:lvl>
   </w:abstractNum>
-  <w:abstractNum w:abstractNumId="22" w15:restartNumberingAfterBreak="0">
+  <w:abstractNum w:abstractNumId="25" w15:restartNumberingAfterBreak="0">
     <w:nsid w:val="3C5011E1"/>
     <w:multiLevelType w:val="multilevel"/>
     <w:tmpl w:val="5128EF9C"/>
@@ -3026,7 +4631,7 @@
       </w:rPr>
     </w:lvl>
   </w:abstractNum>
-  <w:abstractNum w:abstractNumId="23" w15:restartNumberingAfterBreak="0">
+  <w:abstractNum w:abstractNumId="26" w15:restartNumberingAfterBreak="0">
     <w:nsid w:val="3D867784"/>
     <w:multiLevelType w:val="hybridMultilevel"/>
     <w:tmpl w:val="506E22FE"/>
@@ -3116,7 +4721,7 @@
       </w:pPr>
     </w:lvl>
   </w:abstractNum>
-  <w:abstractNum w:abstractNumId="24" w15:restartNumberingAfterBreak="0">
+  <w:abstractNum w:abstractNumId="27" w15:restartNumberingAfterBreak="0">
     <w:nsid w:val="3DCF5F30"/>
     <w:multiLevelType w:val="hybridMultilevel"/>
     <w:tmpl w:val="FB663578"/>
@@ -3229,7 +4834,7 @@
       </w:rPr>
     </w:lvl>
   </w:abstractNum>
-  <w:abstractNum w:abstractNumId="25" w15:restartNumberingAfterBreak="0">
+  <w:abstractNum w:abstractNumId="28" w15:restartNumberingAfterBreak="0">
     <w:nsid w:val="43111FF5"/>
     <w:multiLevelType w:val="multilevel"/>
     <w:tmpl w:val="5690302C"/>
@@ -3342,7 +4947,7 @@
       </w:rPr>
     </w:lvl>
   </w:abstractNum>
-  <w:abstractNum w:abstractNumId="26" w15:restartNumberingAfterBreak="0">
+  <w:abstractNum w:abstractNumId="29" w15:restartNumberingAfterBreak="0">
     <w:nsid w:val="435B3CFA"/>
     <w:multiLevelType w:val="multilevel"/>
     <w:tmpl w:val="1D6AD40A"/>
@@ -3455,7 +5060,156 @@
       </w:rPr>
     </w:lvl>
   </w:abstractNum>
-  <w:abstractNum w:abstractNumId="27" w15:restartNumberingAfterBreak="0">
+  <w:abstractNum w:abstractNumId="30" w15:restartNumberingAfterBreak="0">
+    <w:nsid w:val="43FB2881"/>
+    <w:multiLevelType w:val="multilevel"/>
+    <w:tmpl w:val="0D50FE40"/>
+    <w:lvl w:ilvl="0">
+      <w:start w:val="1"/>
+      <w:numFmt w:val="bullet"/>
+      <w:lvlText w:val=""/>
+      <w:lvlJc w:val="left"/>
+      <w:pPr>
+        <w:tabs>
+          <w:tab w:val="num" w:pos="720"/>
+        </w:tabs>
+        <w:ind w:left="720" w:hanging="360"/>
+      </w:pPr>
+      <w:rPr>
+        <w:rFonts w:ascii="Symbol" w:hAnsi="Symbol" w:hint="default"/>
+        <w:sz w:val="20"/>
+      </w:rPr>
+    </w:lvl>
+    <w:lvl w:ilvl="1">
+      <w:start w:val="1"/>
+      <w:numFmt w:val="bullet"/>
+      <w:lvlText w:val="o"/>
+      <w:lvlJc w:val="left"/>
+      <w:pPr>
+        <w:tabs>
+          <w:tab w:val="num" w:pos="1440"/>
+        </w:tabs>
+        <w:ind w:left="1440" w:hanging="360"/>
+      </w:pPr>
+      <w:rPr>
+        <w:rFonts w:ascii="Courier New" w:hAnsi="Courier New" w:hint="default"/>
+        <w:sz w:val="20"/>
+      </w:rPr>
+    </w:lvl>
+    <w:lvl w:ilvl="2" w:tentative="1">
+      <w:start w:val="1"/>
+      <w:numFmt w:val="bullet"/>
+      <w:lvlText w:val=""/>
+      <w:lvlJc w:val="left"/>
+      <w:pPr>
+        <w:tabs>
+          <w:tab w:val="num" w:pos="2160"/>
+        </w:tabs>
+        <w:ind w:left="2160" w:hanging="360"/>
+      </w:pPr>
+      <w:rPr>
+        <w:rFonts w:ascii="Wingdings" w:hAnsi="Wingdings" w:hint="default"/>
+        <w:sz w:val="20"/>
+      </w:rPr>
+    </w:lvl>
+    <w:lvl w:ilvl="3" w:tentative="1">
+      <w:start w:val="1"/>
+      <w:numFmt w:val="bullet"/>
+      <w:lvlText w:val=""/>
+      <w:lvlJc w:val="left"/>
+      <w:pPr>
+        <w:tabs>
+          <w:tab w:val="num" w:pos="2880"/>
+        </w:tabs>
+        <w:ind w:left="2880" w:hanging="360"/>
+      </w:pPr>
+      <w:rPr>
+        <w:rFonts w:ascii="Wingdings" w:hAnsi="Wingdings" w:hint="default"/>
+        <w:sz w:val="20"/>
+      </w:rPr>
+    </w:lvl>
+    <w:lvl w:ilvl="4" w:tentative="1">
+      <w:start w:val="1"/>
+      <w:numFmt w:val="bullet"/>
+      <w:lvlText w:val=""/>
+      <w:lvlJc w:val="left"/>
+      <w:pPr>
+        <w:tabs>
+          <w:tab w:val="num" w:pos="3600"/>
+        </w:tabs>
+        <w:ind w:left="3600" w:hanging="360"/>
+      </w:pPr>
+      <w:rPr>
+        <w:rFonts w:ascii="Wingdings" w:hAnsi="Wingdings" w:hint="default"/>
+        <w:sz w:val="20"/>
+      </w:rPr>
+    </w:lvl>
+    <w:lvl w:ilvl="5" w:tentative="1">
+      <w:start w:val="1"/>
+      <w:numFmt w:val="bullet"/>
+      <w:lvlText w:val=""/>
+      <w:lvlJc w:val="left"/>
+      <w:pPr>
+        <w:tabs>
+          <w:tab w:val="num" w:pos="4320"/>
+        </w:tabs>
+        <w:ind w:left="4320" w:hanging="360"/>
+      </w:pPr>
+      <w:rPr>
+        <w:rFonts w:ascii="Wingdings" w:hAnsi="Wingdings" w:hint="default"/>
+        <w:sz w:val="20"/>
+      </w:rPr>
+    </w:lvl>
+    <w:lvl w:ilvl="6" w:tentative="1">
+      <w:start w:val="1"/>
+      <w:numFmt w:val="bullet"/>
+      <w:lvlText w:val=""/>
+      <w:lvlJc w:val="left"/>
+      <w:pPr>
+        <w:tabs>
+          <w:tab w:val="num" w:pos="5040"/>
+        </w:tabs>
+        <w:ind w:left="5040" w:hanging="360"/>
+      </w:pPr>
+      <w:rPr>
+        <w:rFonts w:ascii="Wingdings" w:hAnsi="Wingdings" w:hint="default"/>
+        <w:sz w:val="20"/>
+      </w:rPr>
+    </w:lvl>
+    <w:lvl w:ilvl="7" w:tentative="1">
+      <w:start w:val="1"/>
+      <w:numFmt w:val="bullet"/>
+      <w:lvlText w:val=""/>
+      <w:lvlJc w:val="left"/>
+      <w:pPr>
+        <w:tabs>
+          <w:tab w:val="num" w:pos="5760"/>
+        </w:tabs>
+        <w:ind w:left="5760" w:hanging="360"/>
+      </w:pPr>
+      <w:rPr>
+        <w:rFonts w:ascii="Wingdings" w:hAnsi="Wingdings" w:hint="default"/>
+        <w:sz w:val="20"/>
+      </w:rPr>
+    </w:lvl>
+    <w:lvl w:ilvl="8" w:tentative="1">
+      <w:start w:val="1"/>
+      <w:numFmt w:val="bullet"/>
+      <w:lvlText w:val=""/>
+      <w:lvlJc w:val="left"/>
+      <w:pPr>
+        <w:tabs>
+          <w:tab w:val="num" w:pos="6480"/>
+        </w:tabs>
+        <w:ind w:left="6480" w:hanging="360"/>
+      </w:pPr>
+      <w:rPr>
+        <w:rFonts w:ascii="Wingdings" w:hAnsi="Wingdings" w:hint="default"/>
+        <w:sz w:val="20"/>
+      </w:rPr>
+    </w:lvl>
+  </w:abstractNum>
+  <w:abstractNum w:abstractNumId="31" w15:restartNumberingAfterBreak="0">
     <w:nsid w:val="4D5462BD"/>
     <w:multiLevelType w:val="hybridMultilevel"/>
     <w:tmpl w:val="8AAC7702"/>
@@ -3568,7 +5322,7 @@
       </w:rPr>
     </w:lvl>
   </w:abstractNum>
-  <w:abstractNum w:abstractNumId="28" w15:restartNumberingAfterBreak="0">
+  <w:abstractNum w:abstractNumId="32" w15:restartNumberingAfterBreak="0">
     <w:nsid w:val="52281226"/>
     <w:multiLevelType w:val="hybridMultilevel"/>
     <w:tmpl w:val="DD2C86B4"/>
@@ -3681,7 +5435,305 @@
       </w:rPr>
     </w:lvl>
   </w:abstractNum>
-  <w:abstractNum w:abstractNumId="29" w15:restartNumberingAfterBreak="0">
+  <w:abstractNum w:abstractNumId="33" w15:restartNumberingAfterBreak="0">
+    <w:nsid w:val="53BD4099"/>
+    <w:multiLevelType w:val="multilevel"/>
+    <w:tmpl w:val="D77EB740"/>
+    <w:lvl w:ilvl="0">
+      <w:start w:val="1"/>
+      <w:numFmt w:val="bullet"/>
+      <w:lvlText w:val=""/>
+      <w:lvlJc w:val="left"/>
+      <w:pPr>
+        <w:tabs>
+          <w:tab w:val="num" w:pos="720"/>
+        </w:tabs>
+        <w:ind w:left="720" w:hanging="360"/>
+      </w:pPr>
+      <w:rPr>
+        <w:rFonts w:ascii="Symbol" w:hAnsi="Symbol" w:hint="default"/>
+        <w:sz w:val="20"/>
+      </w:rPr>
+    </w:lvl>
+    <w:lvl w:ilvl="1" w:tentative="1">
+      <w:start w:val="1"/>
+      <w:numFmt w:val="bullet"/>
+      <w:lvlText w:val="o"/>
+      <w:lvlJc w:val="left"/>
+      <w:pPr>
+        <w:tabs>
+          <w:tab w:val="num" w:pos="1440"/>
+        </w:tabs>
+        <w:ind w:left="1440" w:hanging="360"/>
+      </w:pPr>
+      <w:rPr>
+        <w:rFonts w:ascii="Courier New" w:hAnsi="Courier New" w:hint="default"/>
+        <w:sz w:val="20"/>
+      </w:rPr>
+    </w:lvl>
+    <w:lvl w:ilvl="2" w:tentative="1">
+      <w:start w:val="1"/>
+      <w:numFmt w:val="bullet"/>
+      <w:lvlText w:val=""/>
+      <w:lvlJc w:val="left"/>
+      <w:pPr>
+        <w:tabs>
+          <w:tab w:val="num" w:pos="2160"/>
+        </w:tabs>
+        <w:ind w:left="2160" w:hanging="360"/>
+      </w:pPr>
+      <w:rPr>
+        <w:rFonts w:ascii="Wingdings" w:hAnsi="Wingdings" w:hint="default"/>
+        <w:sz w:val="20"/>
+      </w:rPr>
+    </w:lvl>
+    <w:lvl w:ilvl="3" w:tentative="1">
+      <w:start w:val="1"/>
+      <w:numFmt w:val="bullet"/>
+      <w:lvlText w:val=""/>
+      <w:lvlJc w:val="left"/>
+      <w:pPr>
+        <w:tabs>
+          <w:tab w:val="num" w:pos="2880"/>
+        </w:tabs>
+        <w:ind w:left="2880" w:hanging="360"/>
+      </w:pPr>
+      <w:rPr>
+        <w:rFonts w:ascii="Wingdings" w:hAnsi="Wingdings" w:hint="default"/>
+        <w:sz w:val="20"/>
+      </w:rPr>
+    </w:lvl>
+    <w:lvl w:ilvl="4" w:tentative="1">
+      <w:start w:val="1"/>
+      <w:numFmt w:val="bullet"/>
+      <w:lvlText w:val=""/>
+      <w:lvlJc w:val="left"/>
+      <w:pPr>
+        <w:tabs>
+          <w:tab w:val="num" w:pos="3600"/>
+        </w:tabs>
+        <w:ind w:left="3600" w:hanging="360"/>
+      </w:pPr>
+      <w:rPr>
+        <w:rFonts w:ascii="Wingdings" w:hAnsi="Wingdings" w:hint="default"/>
+        <w:sz w:val="20"/>
+      </w:rPr>
+    </w:lvl>
+    <w:lvl w:ilvl="5" w:tentative="1">
+      <w:start w:val="1"/>
+      <w:numFmt w:val="bullet"/>
+      <w:lvlText w:val=""/>
+      <w:lvlJc w:val="left"/>
+      <w:pPr>
+        <w:tabs>
+          <w:tab w:val="num" w:pos="4320"/>
+        </w:tabs>
+        <w:ind w:left="4320" w:hanging="360"/>
+      </w:pPr>
+      <w:rPr>
+        <w:rFonts w:ascii="Wingdings" w:hAnsi="Wingdings" w:hint="default"/>
+        <w:sz w:val="20"/>
+      </w:rPr>
+    </w:lvl>
+    <w:lvl w:ilvl="6" w:tentative="1">
+      <w:start w:val="1"/>
+      <w:numFmt w:val="bullet"/>
+      <w:lvlText w:val=""/>
+      <w:lvlJc w:val="left"/>
+      <w:pPr>
+        <w:tabs>
+          <w:tab w:val="num" w:pos="5040"/>
+        </w:tabs>
+        <w:ind w:left="5040" w:hanging="360"/>
+      </w:pPr>
+      <w:rPr>
+        <w:rFonts w:ascii="Wingdings" w:hAnsi="Wingdings" w:hint="default"/>
+        <w:sz w:val="20"/>
+      </w:rPr>
+    </w:lvl>
+    <w:lvl w:ilvl="7" w:tentative="1">
+      <w:start w:val="1"/>
+      <w:numFmt w:val="bullet"/>
+      <w:lvlText w:val=""/>
+      <w:lvlJc w:val="left"/>
+      <w:pPr>
+        <w:tabs>
+          <w:tab w:val="num" w:pos="5760"/>
+        </w:tabs>
+        <w:ind w:left="5760" w:hanging="360"/>
+      </w:pPr>
+      <w:rPr>
+        <w:rFonts w:ascii="Wingdings" w:hAnsi="Wingdings" w:hint="default"/>
+        <w:sz w:val="20"/>
+      </w:rPr>
+    </w:lvl>
+    <w:lvl w:ilvl="8" w:tentative="1">
+      <w:start w:val="1"/>
+      <w:numFmt w:val="bullet"/>
+      <w:lvlText w:val=""/>
+      <w:lvlJc w:val="left"/>
+      <w:pPr>
+        <w:tabs>
+          <w:tab w:val="num" w:pos="6480"/>
+        </w:tabs>
+        <w:ind w:left="6480" w:hanging="360"/>
+      </w:pPr>
+      <w:rPr>
+        <w:rFonts w:ascii="Wingdings" w:hAnsi="Wingdings" w:hint="default"/>
+        <w:sz w:val="20"/>
+      </w:rPr>
+    </w:lvl>
+  </w:abstractNum>
+  <w:abstractNum w:abstractNumId="34" w15:restartNumberingAfterBreak="0">
+    <w:nsid w:val="566B1AFC"/>
+    <w:multiLevelType w:val="multilevel"/>
+    <w:tmpl w:val="B54EEFFE"/>
+    <w:lvl w:ilvl="0">
+      <w:start w:val="1"/>
+      <w:numFmt w:val="bullet"/>
+      <w:lvlText w:val=""/>
+      <w:lvlJc w:val="left"/>
+      <w:pPr>
+        <w:tabs>
+          <w:tab w:val="num" w:pos="720"/>
+        </w:tabs>
+        <w:ind w:left="720" w:hanging="360"/>
+      </w:pPr>
+      <w:rPr>
+        <w:rFonts w:ascii="Symbol" w:hAnsi="Symbol" w:hint="default"/>
+        <w:sz w:val="20"/>
+      </w:rPr>
+    </w:lvl>
+    <w:lvl w:ilvl="1" w:tentative="1">
+      <w:start w:val="1"/>
+      <w:numFmt w:val="bullet"/>
+      <w:lvlText w:val="o"/>
+      <w:lvlJc w:val="left"/>
+      <w:pPr>
+        <w:tabs>
+          <w:tab w:val="num" w:pos="1440"/>
+        </w:tabs>
+        <w:ind w:left="1440" w:hanging="360"/>
+      </w:pPr>
+      <w:rPr>
+        <w:rFonts w:ascii="Courier New" w:hAnsi="Courier New" w:hint="default"/>
+        <w:sz w:val="20"/>
+      </w:rPr>
+    </w:lvl>
+    <w:lvl w:ilvl="2" w:tentative="1">
+      <w:start w:val="1"/>
+      <w:numFmt w:val="bullet"/>
+      <w:lvlText w:val=""/>
+      <w:lvlJc w:val="left"/>
+      <w:pPr>
+        <w:tabs>
+          <w:tab w:val="num" w:pos="2160"/>
+        </w:tabs>
+        <w:ind w:left="2160" w:hanging="360"/>
+      </w:pPr>
+      <w:rPr>
+        <w:rFonts w:ascii="Wingdings" w:hAnsi="Wingdings" w:hint="default"/>
+        <w:sz w:val="20"/>
+      </w:rPr>
+    </w:lvl>
+    <w:lvl w:ilvl="3" w:tentative="1">
+      <w:start w:val="1"/>
+      <w:numFmt w:val="bullet"/>
+      <w:lvlText w:val=""/>
+      <w:lvlJc w:val="left"/>
+      <w:pPr>
+        <w:tabs>
+          <w:tab w:val="num" w:pos="2880"/>
+        </w:tabs>
+        <w:ind w:left="2880" w:hanging="360"/>
+      </w:pPr>
+      <w:rPr>
+        <w:rFonts w:ascii="Wingdings" w:hAnsi="Wingdings" w:hint="default"/>
+        <w:sz w:val="20"/>
+      </w:rPr>
+    </w:lvl>
+    <w:lvl w:ilvl="4" w:tentative="1">
+      <w:start w:val="1"/>
+      <w:numFmt w:val="bullet"/>
+      <w:lvlText w:val=""/>
+      <w:lvlJc w:val="left"/>
+      <w:pPr>
+        <w:tabs>
+          <w:tab w:val="num" w:pos="3600"/>
+        </w:tabs>
+        <w:ind w:left="3600" w:hanging="360"/>
+      </w:pPr>
+      <w:rPr>
+        <w:rFonts w:ascii="Wingdings" w:hAnsi="Wingdings" w:hint="default"/>
+        <w:sz w:val="20"/>
+      </w:rPr>
+    </w:lvl>
+    <w:lvl w:ilvl="5" w:tentative="1">
+      <w:start w:val="1"/>
+      <w:numFmt w:val="bullet"/>
+      <w:lvlText w:val=""/>
+      <w:lvlJc w:val="left"/>
+      <w:pPr>
+        <w:tabs>
+          <w:tab w:val="num" w:pos="4320"/>
+        </w:tabs>
+        <w:ind w:left="4320" w:hanging="360"/>
+      </w:pPr>
+      <w:rPr>
+        <w:rFonts w:ascii="Wingdings" w:hAnsi="Wingdings" w:hint="default"/>
+        <w:sz w:val="20"/>
+      </w:rPr>
+    </w:lvl>
+    <w:lvl w:ilvl="6" w:tentative="1">
+      <w:start w:val="1"/>
+      <w:numFmt w:val="bullet"/>
+      <w:lvlText w:val=""/>
+      <w:lvlJc w:val="left"/>
+      <w:pPr>
+        <w:tabs>
+          <w:tab w:val="num" w:pos="5040"/>
+        </w:tabs>
+        <w:ind w:left="5040" w:hanging="360"/>
+      </w:pPr>
+      <w:rPr>
+        <w:rFonts w:ascii="Wingdings" w:hAnsi="Wingdings" w:hint="default"/>
+        <w:sz w:val="20"/>
+      </w:rPr>
+    </w:lvl>
+    <w:lvl w:ilvl="7" w:tentative="1">
+      <w:start w:val="1"/>
+      <w:numFmt w:val="bullet"/>
+      <w:lvlText w:val=""/>
+      <w:lvlJc w:val="left"/>
+      <w:pPr>
+        <w:tabs>
+          <w:tab w:val="num" w:pos="5760"/>
+        </w:tabs>
+        <w:ind w:left="5760" w:hanging="360"/>
+      </w:pPr>
+      <w:rPr>
+        <w:rFonts w:ascii="Wingdings" w:hAnsi="Wingdings" w:hint="default"/>
+        <w:sz w:val="20"/>
+      </w:rPr>
+    </w:lvl>
+    <w:lvl w:ilvl="8" w:tentative="1">
+      <w:start w:val="1"/>
+      <w:numFmt w:val="bullet"/>
+      <w:lvlText w:val=""/>
+      <w:lvlJc w:val="left"/>
+      <w:pPr>
+        <w:tabs>
+          <w:tab w:val="num" w:pos="6480"/>
+        </w:tabs>
+        <w:ind w:left="6480" w:hanging="360"/>
+      </w:pPr>
+      <w:rPr>
+        <w:rFonts w:ascii="Wingdings" w:hAnsi="Wingdings" w:hint="default"/>
+        <w:sz w:val="20"/>
+      </w:rPr>
+    </w:lvl>
+  </w:abstractNum>
+  <w:abstractNum w:abstractNumId="35" w15:restartNumberingAfterBreak="0">
     <w:nsid w:val="5A716C2D"/>
     <w:multiLevelType w:val="hybridMultilevel"/>
     <w:tmpl w:val="A044D51E"/>
@@ -3771,7 +5823,7 @@
       </w:pPr>
     </w:lvl>
   </w:abstractNum>
-  <w:abstractNum w:abstractNumId="30" w15:restartNumberingAfterBreak="0">
+  <w:abstractNum w:abstractNumId="36" w15:restartNumberingAfterBreak="0">
     <w:nsid w:val="5A955B98"/>
     <w:multiLevelType w:val="multilevel"/>
     <w:tmpl w:val="377279D2"/>
@@ -3884,7 +5936,7 @@
       </w:rPr>
     </w:lvl>
   </w:abstractNum>
-  <w:abstractNum w:abstractNumId="31" w15:restartNumberingAfterBreak="0">
+  <w:abstractNum w:abstractNumId="37" w15:restartNumberingAfterBreak="0">
     <w:nsid w:val="5CB60540"/>
     <w:multiLevelType w:val="hybridMultilevel"/>
     <w:tmpl w:val="2AA0C3BE"/>
@@ -3997,7 +6049,7 @@
       </w:rPr>
     </w:lvl>
   </w:abstractNum>
-  <w:abstractNum w:abstractNumId="32" w15:restartNumberingAfterBreak="0">
+  <w:abstractNum w:abstractNumId="38" w15:restartNumberingAfterBreak="0">
     <w:nsid w:val="63311B73"/>
     <w:multiLevelType w:val="multilevel"/>
     <w:tmpl w:val="6B78752A"/>
@@ -4110,7 +6162,7 @@
       </w:pPr>
     </w:lvl>
   </w:abstractNum>
-  <w:abstractNum w:abstractNumId="33" w15:restartNumberingAfterBreak="0">
+  <w:abstractNum w:abstractNumId="39" w15:restartNumberingAfterBreak="0">
     <w:nsid w:val="63627007"/>
     <w:multiLevelType w:val="hybridMultilevel"/>
     <w:tmpl w:val="1ADA6A44"/>
@@ -4223,7 +6275,7 @@
       </w:rPr>
     </w:lvl>
   </w:abstractNum>
-  <w:abstractNum w:abstractNumId="34" w15:restartNumberingAfterBreak="0">
+  <w:abstractNum w:abstractNumId="40" w15:restartNumberingAfterBreak="0">
     <w:nsid w:val="650F2E91"/>
     <w:multiLevelType w:val="hybridMultilevel"/>
     <w:tmpl w:val="7A126588"/>
@@ -4335,7 +6387,7 @@
       </w:rPr>
     </w:lvl>
   </w:abstractNum>
-  <w:abstractNum w:abstractNumId="35" w15:restartNumberingAfterBreak="0">
+  <w:abstractNum w:abstractNumId="41" w15:restartNumberingAfterBreak="0">
     <w:nsid w:val="6F392FD0"/>
     <w:multiLevelType w:val="multilevel"/>
     <w:tmpl w:val="0840FA2C"/>
@@ -4448,7 +6500,7 @@
       </w:rPr>
     </w:lvl>
   </w:abstractNum>
-  <w:abstractNum w:abstractNumId="36" w15:restartNumberingAfterBreak="0">
+  <w:abstractNum w:abstractNumId="42" w15:restartNumberingAfterBreak="0">
     <w:nsid w:val="70FE229D"/>
     <w:multiLevelType w:val="multilevel"/>
     <w:tmpl w:val="42FAEB3C"/>
@@ -4561,7 +6613,7 @@
       </w:rPr>
     </w:lvl>
   </w:abstractNum>
-  <w:abstractNum w:abstractNumId="37" w15:restartNumberingAfterBreak="0">
+  <w:abstractNum w:abstractNumId="43" w15:restartNumberingAfterBreak="0">
     <w:nsid w:val="732D64E8"/>
     <w:multiLevelType w:val="hybridMultilevel"/>
     <w:tmpl w:val="D4042B92"/>
@@ -4651,7 +6703,7 @@
       </w:pPr>
     </w:lvl>
   </w:abstractNum>
-  <w:abstractNum w:abstractNumId="38" w15:restartNumberingAfterBreak="0">
+  <w:abstractNum w:abstractNumId="44" w15:restartNumberingAfterBreak="0">
     <w:nsid w:val="75A75452"/>
     <w:multiLevelType w:val="multilevel"/>
     <w:tmpl w:val="1018C6C0"/>
@@ -4764,7 +6816,7 @@
       </w:rPr>
     </w:lvl>
   </w:abstractNum>
-  <w:abstractNum w:abstractNumId="39" w15:restartNumberingAfterBreak="0">
+  <w:abstractNum w:abstractNumId="45" w15:restartNumberingAfterBreak="0">
     <w:nsid w:val="774B3AD3"/>
     <w:multiLevelType w:val="multilevel"/>
     <w:tmpl w:val="DC16D568"/>
@@ -4877,7 +6929,7 @@
       </w:pPr>
     </w:lvl>
   </w:abstractNum>
-  <w:abstractNum w:abstractNumId="40" w15:restartNumberingAfterBreak="0">
+  <w:abstractNum w:abstractNumId="46" w15:restartNumberingAfterBreak="0">
     <w:nsid w:val="776E0854"/>
     <w:multiLevelType w:val="hybridMultilevel"/>
     <w:tmpl w:val="53EE6096"/>
@@ -4990,7 +7042,7 @@
       </w:rPr>
     </w:lvl>
   </w:abstractNum>
-  <w:abstractNum w:abstractNumId="41" w15:restartNumberingAfterBreak="0">
+  <w:abstractNum w:abstractNumId="47" w15:restartNumberingAfterBreak="0">
     <w:nsid w:val="78FD5B24"/>
     <w:multiLevelType w:val="hybridMultilevel"/>
     <w:tmpl w:val="82E8A40A"/>
@@ -5103,7 +7155,7 @@
       </w:rPr>
     </w:lvl>
   </w:abstractNum>
-  <w:abstractNum w:abstractNumId="42" w15:restartNumberingAfterBreak="0">
+  <w:abstractNum w:abstractNumId="48" w15:restartNumberingAfterBreak="0">
     <w:nsid w:val="7AF8554A"/>
     <w:multiLevelType w:val="hybridMultilevel"/>
     <w:tmpl w:val="9FA89A44"/>
@@ -5215,7 +7267,7 @@
       </w:rPr>
     </w:lvl>
   </w:abstractNum>
-  <w:abstractNum w:abstractNumId="43" w15:restartNumberingAfterBreak="0">
+  <w:abstractNum w:abstractNumId="49" w15:restartNumberingAfterBreak="0">
     <w:nsid w:val="7F7751C4"/>
     <w:multiLevelType w:val="hybridMultilevel"/>
     <w:tmpl w:val="2E002AE6"/>
@@ -5332,7 +7384,7 @@
     <w:abstractNumId w:val="4"/>
   </w:num>
   <w:num w:numId="2" w16cid:durableId="716466136">
-    <w:abstractNumId w:val="19"/>
+    <w:abstractNumId w:val="21"/>
   </w:num>
   <w:num w:numId="3" w16cid:durableId="1312100650">
     <w:abstractNumId w:val="6"/>
@@ -5341,124 +7393,142 @@
     <w:abstractNumId w:val="1"/>
   </w:num>
   <w:num w:numId="5" w16cid:durableId="346368741">
-    <w:abstractNumId w:val="26"/>
+    <w:abstractNumId w:val="29"/>
   </w:num>
   <w:num w:numId="6" w16cid:durableId="1644306757">
-    <w:abstractNumId w:val="22"/>
+    <w:abstractNumId w:val="25"/>
   </w:num>
   <w:num w:numId="7" w16cid:durableId="1155221505">
     <w:abstractNumId w:val="8"/>
   </w:num>
   <w:num w:numId="8" w16cid:durableId="1505783956">
-    <w:abstractNumId w:val="14"/>
+    <w:abstractNumId w:val="15"/>
   </w:num>
   <w:num w:numId="9" w16cid:durableId="440952782">
-    <w:abstractNumId w:val="16"/>
+    <w:abstractNumId w:val="18"/>
   </w:num>
   <w:num w:numId="10" w16cid:durableId="936138405">
-    <w:abstractNumId w:val="35"/>
+    <w:abstractNumId w:val="41"/>
   </w:num>
   <w:num w:numId="11" w16cid:durableId="1440181811">
-    <w:abstractNumId w:val="30"/>
+    <w:abstractNumId w:val="36"/>
   </w:num>
   <w:num w:numId="12" w16cid:durableId="1613047427">
-    <w:abstractNumId w:val="18"/>
+    <w:abstractNumId w:val="20"/>
   </w:num>
   <w:num w:numId="13" w16cid:durableId="475339305">
-    <w:abstractNumId w:val="38"/>
+    <w:abstractNumId w:val="44"/>
   </w:num>
   <w:num w:numId="14" w16cid:durableId="286934397">
     <w:abstractNumId w:val="5"/>
   </w:num>
   <w:num w:numId="15" w16cid:durableId="1479229189">
-    <w:abstractNumId w:val="25"/>
+    <w:abstractNumId w:val="28"/>
   </w:num>
   <w:num w:numId="16" w16cid:durableId="924806496">
     <w:abstractNumId w:val="2"/>
   </w:num>
   <w:num w:numId="17" w16cid:durableId="1693023808">
-    <w:abstractNumId w:val="36"/>
+    <w:abstractNumId w:val="42"/>
   </w:num>
   <w:num w:numId="18" w16cid:durableId="493374193">
-    <w:abstractNumId w:val="17"/>
+    <w:abstractNumId w:val="19"/>
   </w:num>
   <w:num w:numId="19" w16cid:durableId="1382904658">
-    <w:abstractNumId w:val="39"/>
+    <w:abstractNumId w:val="45"/>
   </w:num>
   <w:num w:numId="20" w16cid:durableId="405804017">
-    <w:abstractNumId w:val="32"/>
+    <w:abstractNumId w:val="38"/>
   </w:num>
   <w:num w:numId="21" w16cid:durableId="1064639026">
     <w:abstractNumId w:val="11"/>
   </w:num>
   <w:num w:numId="22" w16cid:durableId="767434808">
-    <w:abstractNumId w:val="27"/>
+    <w:abstractNumId w:val="31"/>
   </w:num>
   <w:num w:numId="23" w16cid:durableId="1952518053">
-    <w:abstractNumId w:val="34"/>
+    <w:abstractNumId w:val="40"/>
   </w:num>
   <w:num w:numId="24" w16cid:durableId="250507544">
-    <w:abstractNumId w:val="42"/>
+    <w:abstractNumId w:val="48"/>
   </w:num>
   <w:num w:numId="25" w16cid:durableId="377826486">
-    <w:abstractNumId w:val="40"/>
+    <w:abstractNumId w:val="46"/>
   </w:num>
   <w:num w:numId="26" w16cid:durableId="1621104959">
-    <w:abstractNumId w:val="21"/>
+    <w:abstractNumId w:val="24"/>
   </w:num>
   <w:num w:numId="27" w16cid:durableId="1638994211">
-    <w:abstractNumId w:val="15"/>
+    <w:abstractNumId w:val="17"/>
   </w:num>
   <w:num w:numId="28" w16cid:durableId="970211402">
     <w:abstractNumId w:val="9"/>
   </w:num>
   <w:num w:numId="29" w16cid:durableId="1832675720">
-    <w:abstractNumId w:val="33"/>
+    <w:abstractNumId w:val="39"/>
   </w:num>
   <w:num w:numId="30" w16cid:durableId="1527060237">
-    <w:abstractNumId w:val="43"/>
+    <w:abstractNumId w:val="49"/>
   </w:num>
   <w:num w:numId="31" w16cid:durableId="1623069830">
-    <w:abstractNumId w:val="12"/>
+    <w:abstractNumId w:val="13"/>
   </w:num>
   <w:num w:numId="32" w16cid:durableId="1378581011">
-    <w:abstractNumId w:val="41"/>
+    <w:abstractNumId w:val="47"/>
   </w:num>
   <w:num w:numId="33" w16cid:durableId="1431776185">
     <w:abstractNumId w:val="3"/>
   </w:num>
   <w:num w:numId="34" w16cid:durableId="1441334884">
-    <w:abstractNumId w:val="31"/>
+    <w:abstractNumId w:val="37"/>
   </w:num>
   <w:num w:numId="35" w16cid:durableId="1963615455">
     <w:abstractNumId w:val="10"/>
   </w:num>
   <w:num w:numId="36" w16cid:durableId="1380396445">
-    <w:abstractNumId w:val="13"/>
+    <w:abstractNumId w:val="14"/>
   </w:num>
   <w:num w:numId="37" w16cid:durableId="2011247593">
+    <w:abstractNumId w:val="26"/>
+  </w:num>
+  <w:num w:numId="38" w16cid:durableId="622661013">
     <w:abstractNumId w:val="23"/>
   </w:num>
-  <w:num w:numId="38" w16cid:durableId="622661013">
-    <w:abstractNumId w:val="20"/>
-  </w:num>
   <w:num w:numId="39" w16cid:durableId="1682774957">
-    <w:abstractNumId w:val="37"/>
+    <w:abstractNumId w:val="43"/>
   </w:num>
   <w:num w:numId="40" w16cid:durableId="1294941937">
-    <w:abstractNumId w:val="29"/>
+    <w:abstractNumId w:val="35"/>
   </w:num>
   <w:num w:numId="41" w16cid:durableId="1048069444">
     <w:abstractNumId w:val="7"/>
   </w:num>
   <w:num w:numId="42" w16cid:durableId="2032337003">
-    <w:abstractNumId w:val="24"/>
+    <w:abstractNumId w:val="27"/>
   </w:num>
   <w:num w:numId="43" w16cid:durableId="202596009">
-    <w:abstractNumId w:val="28"/>
+    <w:abstractNumId w:val="32"/>
   </w:num>
   <w:num w:numId="44" w16cid:durableId="2046715343">
     <w:abstractNumId w:val="0"/>
+  </w:num>
+  <w:num w:numId="45" w16cid:durableId="1239949197">
+    <w:abstractNumId w:val="30"/>
+  </w:num>
+  <w:num w:numId="46" w16cid:durableId="1596674217">
+    <w:abstractNumId w:val="33"/>
+  </w:num>
+  <w:num w:numId="47" w16cid:durableId="1158884580">
+    <w:abstractNumId w:val="22"/>
+  </w:num>
+  <w:num w:numId="48" w16cid:durableId="1190149027">
+    <w:abstractNumId w:val="34"/>
+  </w:num>
+  <w:num w:numId="49" w16cid:durableId="57018368">
+    <w:abstractNumId w:val="12"/>
+  </w:num>
+  <w:num w:numId="50" w16cid:durableId="618218433">
+    <w:abstractNumId w:val="16"/>
   </w:num>
 </w:numbering>
 </file>

</xml_diff>